<commit_message>
Se agrego link del diseño de stitch del modelo V.20 de mimetic IA
</commit_message>
<xml_diff>
--- a/EntrevistaMIMETICRFyRFN.docx
+++ b/EntrevistaMIMETICRFyRFN.docx
@@ -1,6 +1,6 @@
 
 <file path=word/document.xml><?xml version="1.0" encoding="utf-8"?>
-<w:document xmlns:wpc="http://schemas.microsoft.com/office/word/2010/wordprocessingCanvas" xmlns:mc="http://schemas.openxmlformats.org/markup-compatibility/2006" xmlns:o="urn:schemas-microsoft-com:office:office" xmlns:r="http://schemas.openxmlformats.org/officeDocument/2006/relationships" xmlns:m="http://schemas.openxmlformats.org/officeDocument/2006/math" xmlns:v="urn:schemas-microsoft-com:vml" xmlns:wp14="http://schemas.microsoft.com/office/word/2010/wordprocessingDrawing" xmlns:wp="http://schemas.openxmlformats.org/drawingml/2006/wordprocessingDrawing" xmlns:w10="urn:schemas-microsoft-com:office:word" xmlns:w="http://schemas.openxmlformats.org/wordprocessingml/2006/main" xmlns:w14="http://schemas.microsoft.com/office/word/2010/wordml" xmlns:w15="http://schemas.microsoft.com/office/word/2012/wordml" xmlns:wpg="http://schemas.microsoft.com/office/word/2010/wordprocessingGroup" xmlns:wpi="http://schemas.microsoft.com/office/word/2010/wordprocessingInk" xmlns:wne="http://schemas.microsoft.com/office/word/2006/wordml" xmlns:wps="http://schemas.microsoft.com/office/word/2010/wordprocessingShape" mc:Ignorable="w14 w15 wp14">
+<w:document xmlns:wpc="http://schemas.microsoft.com/office/word/2010/wordprocessingCanvas" xmlns:cx="http://schemas.microsoft.com/office/drawing/2014/chartex" xmlns:cx1="http://schemas.microsoft.com/office/drawing/2015/9/8/chartex" xmlns:cx2="http://schemas.microsoft.com/office/drawing/2015/10/21/chartex" xmlns:cx3="http://schemas.microsoft.com/office/drawing/2016/5/9/chartex" xmlns:cx4="http://schemas.microsoft.com/office/drawing/2016/5/10/chartex" xmlns:cx5="http://schemas.microsoft.com/office/drawing/2016/5/11/chartex" xmlns:cx6="http://schemas.microsoft.com/office/drawing/2016/5/12/chartex" xmlns:cx7="http://schemas.microsoft.com/office/drawing/2016/5/13/chartex" xmlns:cx8="http://schemas.microsoft.com/office/drawing/2016/5/14/chartex" xmlns:mc="http://schemas.openxmlformats.org/markup-compatibility/2006" xmlns:aink="http://schemas.microsoft.com/office/drawing/2016/ink" xmlns:am3d="http://schemas.microsoft.com/office/drawing/2017/model3d" xmlns:o="urn:schemas-microsoft-com:office:office" xmlns:oel="http://schemas.microsoft.com/office/2019/extlst" xmlns:r="http://schemas.openxmlformats.org/officeDocument/2006/relationships" xmlns:m="http://schemas.openxmlformats.org/officeDocument/2006/math" xmlns:v="urn:schemas-microsoft-com:vml" xmlns:wp14="http://schemas.microsoft.com/office/word/2010/wordprocessingDrawing" xmlns:wp="http://schemas.openxmlformats.org/drawingml/2006/wordprocessingDrawing" xmlns:w10="urn:schemas-microsoft-com:office:word" xmlns:w="http://schemas.openxmlformats.org/wordprocessingml/2006/main" xmlns:w14="http://schemas.microsoft.com/office/word/2010/wordml" xmlns:w15="http://schemas.microsoft.com/office/word/2012/wordml" xmlns:w16cex="http://schemas.microsoft.com/office/word/2018/wordml/cex" xmlns:w16cid="http://schemas.microsoft.com/office/word/2016/wordml/cid" xmlns:w16="http://schemas.microsoft.com/office/word/2018/wordml" xmlns:w16du="http://schemas.microsoft.com/office/word/2023/wordml/word16du" xmlns:w16sdtdh="http://schemas.microsoft.com/office/word/2020/wordml/sdtdatahash" xmlns:w16sdtfl="http://schemas.microsoft.com/office/word/2024/wordml/sdtformatlock" xmlns:w16se="http://schemas.microsoft.com/office/word/2015/wordml/symex" xmlns:wpg="http://schemas.microsoft.com/office/word/2010/wordprocessingGroup" xmlns:wpi="http://schemas.microsoft.com/office/word/2010/wordprocessingInk" xmlns:wne="http://schemas.microsoft.com/office/word/2006/wordml" xmlns:wps="http://schemas.microsoft.com/office/word/2010/wordprocessingShape" mc:Ignorable="w14 w15 w16se w16cid w16 w16cex w16sdtdh w16sdtfl w16du wp14">
   <w:body>
     <w:p>
       <w:pPr>
@@ -150,6 +150,12 @@
     <w:sdt>
       <w:sdtPr>
         <w:rPr>
+          <w:rFonts w:eastAsiaTheme="minorEastAsia" w:cstheme="minorBidi"/>
+          <w:b w:val="0"/>
+          <w:bCs w:val="0"/>
+          <w:color w:val="auto"/>
+          <w:sz w:val="24"/>
+          <w:szCs w:val="22"/>
           <w:lang w:val="es-ES"/>
         </w:rPr>
         <w:id w:val="245318337"/>
@@ -158,18 +164,10 @@
           <w:docPartUnique/>
         </w:docPartObj>
       </w:sdtPr>
-      <w:sdtEndPr>
-        <w:rPr>
-          <w:rFonts w:eastAsiaTheme="minorEastAsia" w:cstheme="minorBidi"/>
-          <w:color w:val="auto"/>
-          <w:sz w:val="24"/>
-          <w:szCs w:val="22"/>
-        </w:rPr>
-      </w:sdtEndPr>
       <w:sdtContent>
         <w:p>
           <w:pPr>
-            <w:pStyle w:val="TtulodeTDC"/>
+            <w:pStyle w:val="TtuloTDC"/>
           </w:pPr>
           <w:r>
             <w:rPr>
@@ -643,19 +641,17 @@
       <w:r>
         <w:br w:type="page"/>
       </w:r>
-      <w:bookmarkStart w:id="0" w:name="_GoBack"/>
-      <w:bookmarkEnd w:id="0"/>
     </w:p>
     <w:p>
       <w:pPr>
         <w:pStyle w:val="Ttulo1"/>
       </w:pPr>
-      <w:bookmarkStart w:id="1" w:name="_Toc240232216"/>
+      <w:bookmarkStart w:id="0" w:name="_Toc240232216"/>
       <w:r>
         <w:lastRenderedPageBreak/>
         <w:t>1. Metodología del levantamiento de información</w:t>
       </w:r>
-      <w:bookmarkEnd w:id="1"/>
+      <w:bookmarkEnd w:id="0"/>
     </w:p>
     <w:p>
       <w:pPr>
@@ -732,7 +728,7 @@
       <w:pPr>
         <w:pStyle w:val="Ttulo1"/>
       </w:pPr>
-      <w:bookmarkStart w:id="2" w:name="_Toc240232217"/>
+      <w:bookmarkStart w:id="1" w:name="_Toc240232217"/>
       <w:r>
         <w:lastRenderedPageBreak/>
         <w:t xml:space="preserve">2. Entrevista 1 — Director de Urgencias (Enfoque: Operaciones, Caos e Infraestructura </w:t>
@@ -745,7 +741,7 @@
       <w:r>
         <w:t>)</w:t>
       </w:r>
-      <w:bookmarkEnd w:id="2"/>
+      <w:bookmarkEnd w:id="1"/>
     </w:p>
     <w:p>
       <w:r>
@@ -861,34 +857,12 @@
         <w:rPr>
           <w:i/>
         </w:rPr>
-        <w:t xml:space="preserve">¿Cómo se enteran hoy de que una cama o un quirófano </w:t>
-      </w:r>
-      <w:proofErr w:type="gramStart"/>
-      <w:r>
-        <w:rPr>
-          <w:i/>
-        </w:rPr>
-        <w:t>quedó</w:t>
-      </w:r>
-      <w:proofErr w:type="gramEnd"/>
-      <w:r>
-        <w:rPr>
-          <w:i/>
-        </w:rPr>
-        <w:t xml:space="preserve"> libre?</w:t>
-      </w:r>
-    </w:p>
-    <w:p>
-      <w:r>
-        <w:t xml:space="preserve">  Por radio, por </w:t>
-      </w:r>
-      <w:proofErr w:type="spellStart"/>
-      <w:r>
-        <w:t>WhatsApp</w:t>
-      </w:r>
-      <w:proofErr w:type="spellEnd"/>
-      <w:r>
-        <w:t xml:space="preserve"> interno, por voz. Si un enfermero desocupa una camilla, le avisa a otro que lo necesite. Es informal, no queda registro, y muchas veces nadie se entera hasta que alguien vuelve a pasar por el sitio. Hay planillas en Excel que se actualizan cada dos o tres horas, totalmente desactualizadas. No se puede gestionar lo que no se ve.</w:t>
+        <w:t>¿Cómo se enteran hoy de que una cama o un quirófano quedó libre?</w:t>
+      </w:r>
+    </w:p>
+    <w:p>
+      <w:r>
+        <w:t xml:space="preserve">  Por radio, por WhatsApp interno, por voz. Si un enfermero desocupa una camilla, le avisa a otro que lo necesite. Es informal, no queda registro, y muchas veces nadie se entera hasta que alguien vuelve a pasar por el sitio. Hay planillas en Excel que se actualizan cada dos o tres horas, totalmente desactualizadas. No se puede gestionar lo que no se ve.</w:t>
       </w:r>
     </w:p>
     <w:p>
@@ -1226,12 +1200,12 @@
       <w:pPr>
         <w:pStyle w:val="Ttulo1"/>
       </w:pPr>
-      <w:bookmarkStart w:id="3" w:name="_Toc240232218"/>
+      <w:bookmarkStart w:id="2" w:name="_Toc240232218"/>
       <w:r>
         <w:lastRenderedPageBreak/>
         <w:t>3. Entrevista 2 — Médica Internista (Enfoque: Carga Administrativa, IA Predictiva y Hábitos de Pacientes)</w:t>
       </w:r>
-      <w:bookmarkEnd w:id="3"/>
+      <w:bookmarkEnd w:id="2"/>
     </w:p>
     <w:p>
       <w:r>
@@ -1349,15 +1323,7 @@
     </w:p>
     <w:p>
       <w:r>
-        <w:t xml:space="preserve">  Mucho. '</w:t>
-      </w:r>
-      <w:proofErr w:type="spellStart"/>
-      <w:r>
-        <w:t>Metformina</w:t>
-      </w:r>
-      <w:proofErr w:type="spellEnd"/>
-      <w:r>
-        <w:t>' y 'morfina' se escuchan parecido; '5 mg' y '50 mg' se confunden con facilidad. Necesito que el sistema entienda el contexto clínico, use un diccionario médico, valide unidades y dosis contra rangos razonables y me marque cualquier duda antes de guardar. Que me haga una pregunta de confirmación cuando la dosis sea inusual por encima del máximo. Eso me daría tranquilidad legal y clínica.</w:t>
+        <w:t xml:space="preserve">  Mucho. 'Metformina' y 'morfina' se escuchan parecido; '5 mg' y '50 mg' se confunden con facilidad. Necesito que el sistema entienda el contexto clínico, use un diccionario médico, valide unidades y dosis contra rangos razonables y me marque cualquier duda antes de guardar. Que me haga una pregunta de confirmación cuando la dosis sea inusual por encima del máximo. Eso me daría tranquilidad legal y clínica.</w:t>
       </w:r>
     </w:p>
     <w:p>
@@ -1398,15 +1364,7 @@
     </w:p>
     <w:p>
       <w:r>
-        <w:t xml:space="preserve">  Es un perfil curioso: la persona camina mucho en el día (activa) pero la mayor parte del tiempo está sentada en largos períodos (sedentaria). Ese patrón es un factor de riesgo que las métricas puramente numéricas esconden. Prefiero que el sistema me traduzca los números del </w:t>
-      </w:r>
-      <w:proofErr w:type="spellStart"/>
-      <w:r>
-        <w:t>wearable</w:t>
-      </w:r>
-      <w:proofErr w:type="spellEnd"/>
-      <w:r>
-        <w:t xml:space="preserve"> a etiquetas cualitativas: 'sedentario activo', 'activo regular', 'alto riesgo de inactividad'. Con la etiqueta, la consulta se enfoca: puedo preguntarle directamente y sugerir cambios, en vez de interpretar una tabla de pasos.</w:t>
+        <w:t xml:space="preserve">  Es un perfil curioso: la persona camina mucho en el día (activa) pero la mayor parte del tiempo está sentada en largos períodos (sedentaria). Ese patrón es un factor de riesgo que las métricas puramente numéricas esconden. Prefiero que el sistema me traduzca los números del wearable a etiquetas cualitativas: 'sedentario activo', 'activo regular', 'alto riesgo de inactividad'. Con la etiqueta, la consulta se enfoca: puedo preguntarle directamente y sugerir cambios, en vez de interpretar una tabla de pasos.</w:t>
       </w:r>
     </w:p>
     <w:p>
@@ -1426,15 +1384,7 @@
     </w:p>
     <w:p>
       <w:r>
-        <w:t xml:space="preserve">  Importante. Un paciente asmático o con EPOC se descompensa con mala calidad del aire y cambios bruscos de temperatura; una ola de calor amenaza al hipertenso. Combinar la variabilidad del corazón y la actividad del </w:t>
-      </w:r>
-      <w:proofErr w:type="spellStart"/>
-      <w:r>
-        <w:t>wearable</w:t>
-      </w:r>
-      <w:proofErr w:type="spellEnd"/>
-      <w:r>
-        <w:t xml:space="preserve"> con datos del clima y del índice de calidad del aire me permitiría alertar al paciente antes de que aparezcan los síntomas y priorizar esos casos en la consulta.</w:t>
+        <w:t xml:space="preserve">  Importante. Un paciente asmático o con EPOC se descompensa con mala calidad del aire y cambios bruscos de temperatura; una ola de calor amenaza al hipertenso. Combinar la variabilidad del corazón y la actividad del wearable con datos del clima y del índice de calidad del aire me permitiría alertar al paciente antes de que aparezcan los síntomas y priorizar esos casos en la consulta.</w:t>
       </w:r>
     </w:p>
     <w:p>
@@ -1449,21 +1399,7 @@
         <w:rPr>
           <w:i/>
         </w:rPr>
-        <w:t xml:space="preserve">¿Cuáles son sus mayores preocupaciones con el uso de </w:t>
-      </w:r>
-      <w:proofErr w:type="spellStart"/>
-      <w:r>
-        <w:rPr>
-          <w:i/>
-        </w:rPr>
-        <w:t>wearables</w:t>
-      </w:r>
-      <w:proofErr w:type="spellEnd"/>
-      <w:r>
-        <w:rPr>
-          <w:i/>
-        </w:rPr>
-        <w:t xml:space="preserve"> en pacientes?</w:t>
+        <w:t>¿Cuáles son sus mayores preocupaciones con el uso de wearables en pacientes?</w:t>
       </w:r>
     </w:p>
     <w:p>
@@ -1550,15 +1486,7 @@
     <w:p>
       <w:r>
         <w:lastRenderedPageBreak/>
-        <w:t xml:space="preserve">  Velocidad, precisión y que me quite pasos, no que me los agregue. Si dictar es más lento que escribir, no lo uso. Si la nota llega a la historia clínica correcta sin que yo la copie, lo uso. Si las alertas del </w:t>
-      </w:r>
-      <w:proofErr w:type="spellStart"/>
-      <w:r>
-        <w:t>wearable</w:t>
-      </w:r>
-      <w:proofErr w:type="spellEnd"/>
-      <w:r>
-        <w:t xml:space="preserve"> y de saturación llegan cuando son útiles y con contexto, le confío y lo recomiendo a mis colegas.</w:t>
+        <w:t xml:space="preserve">  Velocidad, precisión y que me quite pasos, no que me los agregue. Si dictar es más lento que escribir, no lo uso. Si la nota llega a la historia clínica correcta sin que yo la copie, lo uso. Si las alertas del wearable y de saturación llegan cuando son útiles y con contexto, le confío y lo recomiendo a mis colegas.</w:t>
       </w:r>
     </w:p>
     <w:p>
@@ -1613,15 +1541,7 @@
         <w:t xml:space="preserve">IA confiable: </w:t>
       </w:r>
       <w:r>
-        <w:t xml:space="preserve">La IA predictiva (colapso de urgencias y riesgo en </w:t>
-      </w:r>
-      <w:proofErr w:type="spellStart"/>
-      <w:r>
-        <w:t>wearables</w:t>
-      </w:r>
-      <w:proofErr w:type="spellEnd"/>
-      <w:r>
-        <w:t>) es valiosa solo si es explicable y con baja tasa de falsas alarmas.</w:t>
+        <w:t>La IA predictiva (colapso de urgencias y riesgo en wearables) es valiosa solo si es explicable y con baja tasa de falsas alarmas.</w:t>
       </w:r>
     </w:p>
     <w:p>
@@ -1635,15 +1555,7 @@
         <w:t xml:space="preserve">Hábitos: </w:t>
       </w:r>
       <w:r>
-        <w:t xml:space="preserve">Las métricas del </w:t>
-      </w:r>
-      <w:proofErr w:type="spellStart"/>
-      <w:r>
-        <w:t>wearable</w:t>
-      </w:r>
-      <w:proofErr w:type="spellEnd"/>
-      <w:r>
-        <w:t xml:space="preserve"> deben traducirse a etiquetas cualitativas (p. ej., 'sedentario activo') y combinarse con datos de clima.</w:t>
+        <w:t>Las métricas del wearable deben traducirse a etiquetas cualitativas (p. ej., 'sedentario activo') y combinarse con datos de clima.</w:t>
       </w:r>
     </w:p>
     <w:p>
@@ -1683,7 +1595,7 @@
       <w:pPr>
         <w:pStyle w:val="Ttulo1"/>
       </w:pPr>
-      <w:bookmarkStart w:id="4" w:name="_Toc240232219"/>
+      <w:bookmarkStart w:id="3" w:name="_Toc240232219"/>
       <w:r>
         <w:lastRenderedPageBreak/>
         <w:t xml:space="preserve">4. Entrevista 3 — Encargado de Gestión de Archivo y Admisiones (Enfoque: </w:t>
@@ -1696,7 +1608,7 @@
       <w:r>
         <w:t>, Papeleo y Pérdida de Documentos)</w:t>
       </w:r>
-      <w:bookmarkEnd w:id="4"/>
+      <w:bookmarkEnd w:id="3"/>
     </w:p>
     <w:p>
       <w:r>
@@ -1878,28 +1790,12 @@
         <w:t xml:space="preserve">Analista: </w:t>
       </w:r>
       <w:r>
-        <w:t xml:space="preserve">¿Cómo debería llegarle el resumen de atención al paciente: correo, SMS, app, </w:t>
-      </w:r>
-      <w:proofErr w:type="spellStart"/>
-      <w:r>
-        <w:t>WhatsApp</w:t>
-      </w:r>
-      <w:proofErr w:type="spellEnd"/>
-      <w:r>
-        <w:t>?</w:t>
-      </w:r>
-    </w:p>
-    <w:p>
-      <w:r>
-        <w:t xml:space="preserve">  Lo ideal es correo electrónico o la app, con una opción de descarga en PDF. </w:t>
-      </w:r>
-      <w:proofErr w:type="spellStart"/>
-      <w:r>
-        <w:t>WhatsApp</w:t>
-      </w:r>
-      <w:proofErr w:type="spellEnd"/>
-      <w:r>
-        <w:t xml:space="preserve"> sería útil para personas mayores o sin correo, pero hay que cuidar la privacidad y el consentimiento. El sistema debe registrar si el envío se entregó o falló y permitir reenviar. Cuando el paciente no </w:t>
+        <w:t>¿Cómo debería llegarle el resumen de atención al paciente: correo, SMS, app, WhatsApp?</w:t>
+      </w:r>
+    </w:p>
+    <w:p>
+      <w:r>
+        <w:t xml:space="preserve">  Lo ideal es correo electrónico o la app, con una opción de descarga en PDF. WhatsApp sería útil para personas mayores o sin correo, pero hay que cuidar la privacidad y el consentimiento. El sistema debe registrar si el envío se entregó o falló y permitir reenviar. Cuando el paciente no </w:t>
       </w:r>
       <w:r>
         <w:lastRenderedPageBreak/>
@@ -2053,15 +1949,7 @@
         <w:t xml:space="preserve">Trazabilidad: </w:t>
       </w:r>
       <w:r>
-        <w:t>Todo cambio o acceso debe quedar inmutable y auditable (</w:t>
-      </w:r>
-      <w:proofErr w:type="spellStart"/>
-      <w:r>
-        <w:t>blockchain</w:t>
-      </w:r>
-      <w:proofErr w:type="spellEnd"/>
-      <w:r>
-        <w:t>) y verificable en cualquier momento.</w:t>
+        <w:t>Todo cambio o acceso debe quedar inmutable y auditable (blockchain) y verificable en cualquier momento.</w:t>
       </w:r>
     </w:p>
     <w:p>
@@ -2101,24 +1989,16 @@
       <w:pPr>
         <w:pStyle w:val="Ttulo1"/>
       </w:pPr>
-      <w:bookmarkStart w:id="5" w:name="_Toc240232220"/>
+      <w:bookmarkStart w:id="4" w:name="_Toc240232220"/>
       <w:r>
         <w:lastRenderedPageBreak/>
         <w:t>5. Requerimientos Funcionales (RF)</w:t>
       </w:r>
-      <w:bookmarkEnd w:id="5"/>
-    </w:p>
-    <w:p>
-      <w:r>
-        <w:t xml:space="preserve">Los requerimientos se consolidan de las tres entrevistas y se priorizan con la técnica </w:t>
-      </w:r>
-      <w:proofErr w:type="spellStart"/>
-      <w:r>
-        <w:t>MoSCoW</w:t>
-      </w:r>
-      <w:proofErr w:type="spellEnd"/>
-      <w:r>
-        <w:t>. Cada requerimiento indica su fuente y el caso de uso de referencia (CU) que lo implementará.</w:t>
+      <w:bookmarkEnd w:id="4"/>
+    </w:p>
+    <w:p>
+      <w:r>
+        <w:t>Los requerimientos se consolidan de las tres entrevistas y se priorizan con la técnica MoSCoW. Cada requerimiento indica su fuente y el caso de uso de referencia (CU) que lo implementará.</w:t>
       </w:r>
     </w:p>
     <w:p>
@@ -2759,19 +2639,8 @@
           <w:szCs w:val="24"/>
           <w:lang w:eastAsia="es-CO"/>
         </w:rPr>
-        <w:t xml:space="preserve"> y almacenamiento de </w:t>
-      </w:r>
-      <w:proofErr w:type="spellStart"/>
-      <w:r>
-        <w:rPr>
-          <w:rFonts w:eastAsia="Times New Roman" w:cs="Times New Roman"/>
-          <w:color w:val="1F1F1F"/>
-          <w:szCs w:val="24"/>
-          <w:lang w:eastAsia="es-CO"/>
-        </w:rPr>
-        <w:t>logs</w:t>
-      </w:r>
-      <w:proofErr w:type="spellEnd"/>
+        <w:t xml:space="preserve"> y almacenamiento de logs</w:t>
+      </w:r>
     </w:p>
     <w:p>
       <w:pPr>
@@ -2827,47 +2696,7 @@
           <w:szCs w:val="24"/>
           <w:lang w:eastAsia="es-CO"/>
         </w:rPr>
-        <w:t xml:space="preserve"> no estructurados y los </w:t>
-      </w:r>
-      <w:proofErr w:type="spellStart"/>
-      <w:r>
-        <w:rPr>
-          <w:rFonts w:eastAsia="Times New Roman" w:cs="Times New Roman"/>
-          <w:color w:val="1F1F1F"/>
-          <w:szCs w:val="24"/>
-          <w:lang w:eastAsia="es-CO"/>
-        </w:rPr>
-        <w:t>logs</w:t>
-      </w:r>
-      <w:proofErr w:type="spellEnd"/>
-      <w:r>
-        <w:rPr>
-          <w:rFonts w:eastAsia="Times New Roman" w:cs="Times New Roman"/>
-          <w:color w:val="1F1F1F"/>
-          <w:szCs w:val="24"/>
-          <w:lang w:eastAsia="es-CO"/>
-        </w:rPr>
-        <w:t xml:space="preserve"> generados por los sensores en una base de datos </w:t>
-      </w:r>
-      <w:proofErr w:type="spellStart"/>
-      <w:r>
-        <w:rPr>
-          <w:rFonts w:eastAsia="Times New Roman" w:cs="Times New Roman"/>
-          <w:color w:val="1F1F1F"/>
-          <w:szCs w:val="24"/>
-          <w:lang w:eastAsia="es-CO"/>
-        </w:rPr>
-        <w:t>MongoDB</w:t>
-      </w:r>
-      <w:proofErr w:type="spellEnd"/>
-      <w:r>
-        <w:rPr>
-          <w:rFonts w:eastAsia="Times New Roman" w:cs="Times New Roman"/>
-          <w:color w:val="1F1F1F"/>
-          <w:szCs w:val="24"/>
-          <w:lang w:eastAsia="es-CO"/>
-        </w:rPr>
-        <w:t xml:space="preserve"> (incluyendo marcas de tiempo, sensor, ubicación y estado), conservando el histórico para análisis posterior.</w:t>
+        <w:t xml:space="preserve"> no estructurados y los logs generados por los sensores en una base de datos MongoDB (incluyendo marcas de tiempo, sensor, ubicación y estado), conservando el histórico para análisis posterior.</w:t>
       </w:r>
     </w:p>
     <w:p>
@@ -4041,27 +3870,7 @@
           <w:szCs w:val="24"/>
           <w:lang w:eastAsia="es-CO"/>
         </w:rPr>
-        <w:t xml:space="preserve"> El sistema debe almacenar historias clínicas estructuradas en </w:t>
-      </w:r>
-      <w:proofErr w:type="spellStart"/>
-      <w:r>
-        <w:rPr>
-          <w:rFonts w:eastAsia="Times New Roman" w:cs="Times New Roman"/>
-          <w:color w:val="1F1F1F"/>
-          <w:szCs w:val="24"/>
-          <w:lang w:eastAsia="es-CO"/>
-        </w:rPr>
-        <w:t>PostgreSQL</w:t>
-      </w:r>
-      <w:proofErr w:type="spellEnd"/>
-      <w:r>
-        <w:rPr>
-          <w:rFonts w:eastAsia="Times New Roman" w:cs="Times New Roman"/>
-          <w:color w:val="1F1F1F"/>
-          <w:szCs w:val="24"/>
-          <w:lang w:eastAsia="es-CO"/>
-        </w:rPr>
-        <w:t xml:space="preserve"> bajo el estándar HL7/FHIR, garantizando interoperabilidad y 0 errores de formato en la creación y consulta.</w:t>
+        <w:t xml:space="preserve"> El sistema debe almacenar historias clínicas estructuradas en PostgreSQL bajo el estándar HL7/FHIR, garantizando interoperabilidad y 0 errores de formato en la creación y consulta.</w:t>
       </w:r>
     </w:p>
     <w:p>
@@ -4708,27 +4517,7 @@
           <w:szCs w:val="24"/>
           <w:lang w:eastAsia="es-CO"/>
         </w:rPr>
-        <w:t xml:space="preserve"> Registro inmutable de transacciones (</w:t>
-      </w:r>
-      <w:proofErr w:type="spellStart"/>
-      <w:r>
-        <w:rPr>
-          <w:rFonts w:eastAsia="Times New Roman" w:cs="Times New Roman"/>
-          <w:color w:val="1F1F1F"/>
-          <w:szCs w:val="24"/>
-          <w:lang w:eastAsia="es-CO"/>
-        </w:rPr>
-        <w:t>Blockchain</w:t>
-      </w:r>
-      <w:proofErr w:type="spellEnd"/>
-      <w:r>
-        <w:rPr>
-          <w:rFonts w:eastAsia="Times New Roman" w:cs="Times New Roman"/>
-          <w:color w:val="1F1F1F"/>
-          <w:szCs w:val="24"/>
-          <w:lang w:eastAsia="es-CO"/>
-        </w:rPr>
-        <w:t>)</w:t>
+        <w:t xml:space="preserve"> Registro inmutable de transacciones (Blockchain)</w:t>
       </w:r>
     </w:p>
     <w:p>
@@ -4765,27 +4554,7 @@
           <w:szCs w:val="24"/>
           <w:lang w:eastAsia="es-CO"/>
         </w:rPr>
-        <w:t xml:space="preserve"> El sistema debe registrar de forma inmutable cada transacción clínica, consentimiento, orden de traslado y cambio de estado documental en una red </w:t>
-      </w:r>
-      <w:proofErr w:type="spellStart"/>
-      <w:r>
-        <w:rPr>
-          <w:rFonts w:eastAsia="Times New Roman" w:cs="Times New Roman"/>
-          <w:color w:val="1F1F1F"/>
-          <w:szCs w:val="24"/>
-          <w:lang w:eastAsia="es-CO"/>
-        </w:rPr>
-        <w:t>Blockchain</w:t>
-      </w:r>
-      <w:proofErr w:type="spellEnd"/>
-      <w:r>
-        <w:rPr>
-          <w:rFonts w:eastAsia="Times New Roman" w:cs="Times New Roman"/>
-          <w:color w:val="1F1F1F"/>
-          <w:szCs w:val="24"/>
-          <w:lang w:eastAsia="es-CO"/>
-        </w:rPr>
-        <w:t>, permitiendo verificar posteriormente que el registro no fue alterado.</w:t>
+        <w:t xml:space="preserve"> El sistema debe registrar de forma inmutable cada transacción clínica, consentimiento, orden de traslado y cambio de estado documental en una red Blockchain, permitiendo verificar posteriormente que el registro no fue alterado.</w:t>
       </w:r>
     </w:p>
     <w:p>
@@ -5242,27 +5011,7 @@
           <w:szCs w:val="24"/>
           <w:lang w:eastAsia="es-CO"/>
         </w:rPr>
-        <w:t>, director de urgencias, médico, enfermero, admisiones/archivo, paciente) con autenticación JWT/</w:t>
-      </w:r>
-      <w:proofErr w:type="spellStart"/>
-      <w:r>
-        <w:rPr>
-          <w:rFonts w:eastAsia="Times New Roman" w:cs="Times New Roman"/>
-          <w:color w:val="1F1F1F"/>
-          <w:szCs w:val="24"/>
-          <w:lang w:eastAsia="es-CO"/>
-        </w:rPr>
-        <w:t>OAuth</w:t>
-      </w:r>
-      <w:proofErr w:type="spellEnd"/>
-      <w:r>
-        <w:rPr>
-          <w:rFonts w:eastAsia="Times New Roman" w:cs="Times New Roman"/>
-          <w:color w:val="1F1F1F"/>
-          <w:szCs w:val="24"/>
-          <w:lang w:eastAsia="es-CO"/>
-        </w:rPr>
-        <w:t xml:space="preserve"> y validar el acceso de cada rol a las funciones correspondientes.</w:t>
+        <w:t>, director de urgencias, médico, enfermero, admisiones/archivo, paciente) con autenticación JWT/OAuth y validar el acceso de cada rol a las funciones correspondientes.</w:t>
       </w:r>
     </w:p>
     <w:p>
@@ -6161,27 +5910,7 @@
           <w:szCs w:val="24"/>
           <w:lang w:eastAsia="es-CO"/>
         </w:rPr>
-        <w:t xml:space="preserve"> </w:t>
-      </w:r>
-      <w:proofErr w:type="spellStart"/>
-      <w:r>
-        <w:rPr>
-          <w:rFonts w:eastAsia="Times New Roman" w:cs="Times New Roman"/>
-          <w:color w:val="1F1F1F"/>
-          <w:szCs w:val="24"/>
-          <w:lang w:eastAsia="es-CO"/>
-        </w:rPr>
-        <w:t>Wearables</w:t>
-      </w:r>
-      <w:proofErr w:type="spellEnd"/>
-      <w:r>
-        <w:rPr>
-          <w:rFonts w:eastAsia="Times New Roman" w:cs="Times New Roman"/>
-          <w:color w:val="1F1F1F"/>
-          <w:szCs w:val="24"/>
-          <w:lang w:eastAsia="es-CO"/>
-        </w:rPr>
-        <w:t>: captura de datos de salud</w:t>
+        <w:t xml:space="preserve"> Wearables: captura de datos de salud</w:t>
       </w:r>
     </w:p>
     <w:p>
@@ -6218,27 +5947,7 @@
           <w:szCs w:val="24"/>
           <w:lang w:eastAsia="es-CO"/>
         </w:rPr>
-        <w:t xml:space="preserve"> El sistema debe recibir y procesar datos de </w:t>
-      </w:r>
-      <w:proofErr w:type="spellStart"/>
-      <w:r>
-        <w:rPr>
-          <w:rFonts w:eastAsia="Times New Roman" w:cs="Times New Roman"/>
-          <w:color w:val="1F1F1F"/>
-          <w:szCs w:val="24"/>
-          <w:lang w:eastAsia="es-CO"/>
-        </w:rPr>
-        <w:t>wearables</w:t>
-      </w:r>
-      <w:proofErr w:type="spellEnd"/>
-      <w:r>
-        <w:rPr>
-          <w:rFonts w:eastAsia="Times New Roman" w:cs="Times New Roman"/>
-          <w:color w:val="1F1F1F"/>
-          <w:szCs w:val="24"/>
-          <w:lang w:eastAsia="es-CO"/>
-        </w:rPr>
-        <w:t xml:space="preserve"> (sensores PPG y acelerómetros) asociados a pacientes dados de alta, incluyendo frecuencia cardíaca, variabilidad, actividad y períodos de reposo.</w:t>
+        <w:t xml:space="preserve"> El sistema debe recibir y procesar datos de wearables (sensores PPG y acelerómetros) asociados a pacientes dados de alta, incluyendo frecuencia cardíaca, variabilidad, actividad y períodos de reposo.</w:t>
       </w:r>
     </w:p>
     <w:p>
@@ -6463,27 +6172,7 @@
           <w:szCs w:val="24"/>
           <w:lang w:eastAsia="es-CO"/>
         </w:rPr>
-        <w:t xml:space="preserve"> El sistema debe transformar las métricas numéricas de los </w:t>
-      </w:r>
-      <w:proofErr w:type="spellStart"/>
-      <w:r>
-        <w:rPr>
-          <w:rFonts w:eastAsia="Times New Roman" w:cs="Times New Roman"/>
-          <w:color w:val="1F1F1F"/>
-          <w:szCs w:val="24"/>
-          <w:lang w:eastAsia="es-CO"/>
-        </w:rPr>
-        <w:t>wearables</w:t>
-      </w:r>
-      <w:proofErr w:type="spellEnd"/>
-      <w:r>
-        <w:rPr>
-          <w:rFonts w:eastAsia="Times New Roman" w:cs="Times New Roman"/>
-          <w:color w:val="1F1F1F"/>
-          <w:szCs w:val="24"/>
-          <w:lang w:eastAsia="es-CO"/>
-        </w:rPr>
-        <w:t xml:space="preserve"> en etiquetas cualitativas (p. ej., 'sedentario activo', 'activo regular') e identificar perfiles de riesgo para generar alertas personalizadas.</w:t>
+        <w:t xml:space="preserve"> El sistema debe transformar las métricas numéricas de los wearables en etiquetas cualitativas (p. ej., 'sedentario activo', 'activo regular') e identificar perfiles de riesgo para generar alertas personalizadas.</w:t>
       </w:r>
     </w:p>
     <w:p>
@@ -6726,27 +6415,7 @@
           <w:szCs w:val="24"/>
           <w:lang w:eastAsia="es-CO"/>
         </w:rPr>
-        <w:t xml:space="preserve">) con los datos de los </w:t>
-      </w:r>
-      <w:proofErr w:type="spellStart"/>
-      <w:r>
-        <w:rPr>
-          <w:rFonts w:eastAsia="Times New Roman" w:cs="Times New Roman"/>
-          <w:color w:val="1F1F1F"/>
-          <w:szCs w:val="24"/>
-          <w:lang w:eastAsia="es-CO"/>
-        </w:rPr>
-        <w:t>wearables</w:t>
-      </w:r>
-      <w:proofErr w:type="spellEnd"/>
-      <w:r>
-        <w:rPr>
-          <w:rFonts w:eastAsia="Times New Roman" w:cs="Times New Roman"/>
-          <w:color w:val="1F1F1F"/>
-          <w:szCs w:val="24"/>
-          <w:lang w:eastAsia="es-CO"/>
-        </w:rPr>
-        <w:t xml:space="preserve"> para ajustar las alertas de riesgo de los pacientes crónicos.</w:t>
+        <w:t>) con los datos de los wearables para ajustar las alertas de riesgo de los pacientes crónicos.</w:t>
       </w:r>
     </w:p>
     <w:p>
@@ -7192,27 +6861,7 @@
           <w:szCs w:val="24"/>
           <w:lang w:eastAsia="es-CO"/>
         </w:rPr>
-        <w:t xml:space="preserve"> El sistema debe emitir alertas de ocupación, saturación proyectada y riesgo en pacientes con </w:t>
-      </w:r>
-      <w:proofErr w:type="spellStart"/>
-      <w:r>
-        <w:rPr>
-          <w:rFonts w:eastAsia="Times New Roman" w:cs="Times New Roman"/>
-          <w:color w:val="1F1F1F"/>
-          <w:szCs w:val="24"/>
-          <w:lang w:eastAsia="es-CO"/>
-        </w:rPr>
-        <w:t>wearable</w:t>
-      </w:r>
-      <w:proofErr w:type="spellEnd"/>
-      <w:r>
-        <w:rPr>
-          <w:rFonts w:eastAsia="Times New Roman" w:cs="Times New Roman"/>
-          <w:color w:val="1F1F1F"/>
-          <w:szCs w:val="24"/>
-          <w:lang w:eastAsia="es-CO"/>
-        </w:rPr>
-        <w:t xml:space="preserve"> bajo umbrales configurables, con escalonamiento por canal (panel, jefe de turno, dirección) para evitar fatiga de alertas.</w:t>
+        <w:t xml:space="preserve"> El sistema debe emitir alertas de ocupación, saturación proyectada y riesgo en pacientes con wearable bajo umbrales configurables, con escalonamiento por canal (panel, jefe de turno, dirección) para evitar fatiga de alertas.</w:t>
       </w:r>
     </w:p>
     <w:p>
@@ -7625,27 +7274,7 @@
           <w:szCs w:val="24"/>
           <w:lang w:eastAsia="es-CO"/>
         </w:rPr>
-        <w:t xml:space="preserve"> Modo contingencia offline (</w:t>
-      </w:r>
-      <w:proofErr w:type="spellStart"/>
-      <w:r>
-        <w:rPr>
-          <w:rFonts w:eastAsia="Times New Roman" w:cs="Times New Roman"/>
-          <w:color w:val="1F1F1F"/>
-          <w:szCs w:val="24"/>
-          <w:lang w:eastAsia="es-CO"/>
-        </w:rPr>
-        <w:t>Edge</w:t>
-      </w:r>
-      <w:proofErr w:type="spellEnd"/>
-      <w:r>
-        <w:rPr>
-          <w:rFonts w:eastAsia="Times New Roman" w:cs="Times New Roman"/>
-          <w:color w:val="1F1F1F"/>
-          <w:szCs w:val="24"/>
-          <w:lang w:eastAsia="es-CO"/>
-        </w:rPr>
-        <w:t xml:space="preserve"> Computing)</w:t>
+        <w:t xml:space="preserve"> Modo contingencia offline (Edge Computing)</w:t>
       </w:r>
     </w:p>
     <w:p>
@@ -7943,27 +7572,7 @@
           <w:szCs w:val="24"/>
           <w:lang w:eastAsia="es-CO"/>
         </w:rPr>
-        <w:t xml:space="preserve"> El sistema debe permitir a cualquier rol autorizado verificar en cualquier momento que un documento o historia no fue alterado desde su firma (integridad), apoyándose en el registro </w:t>
-      </w:r>
-      <w:proofErr w:type="spellStart"/>
-      <w:r>
-        <w:rPr>
-          <w:rFonts w:eastAsia="Times New Roman" w:cs="Times New Roman"/>
-          <w:color w:val="1F1F1F"/>
-          <w:szCs w:val="24"/>
-          <w:lang w:eastAsia="es-CO"/>
-        </w:rPr>
-        <w:t>blockchain</w:t>
-      </w:r>
-      <w:proofErr w:type="spellEnd"/>
-      <w:r>
-        <w:rPr>
-          <w:rFonts w:eastAsia="Times New Roman" w:cs="Times New Roman"/>
-          <w:color w:val="1F1F1F"/>
-          <w:szCs w:val="24"/>
-          <w:lang w:eastAsia="es-CO"/>
-        </w:rPr>
-        <w:t>.</w:t>
+        <w:t xml:space="preserve"> El sistema debe permitir a cualquier rol autorizado verificar en cualquier momento que un documento o historia no fue alterado desde su firma (integridad), apoyándose en el registro blockchain.</w:t>
       </w:r>
     </w:p>
     <w:p>
@@ -9034,12 +8643,12 @@
       <w:pPr>
         <w:pStyle w:val="Ttulo1"/>
       </w:pPr>
-      <w:bookmarkStart w:id="6" w:name="_Toc240232221"/>
+      <w:bookmarkStart w:id="5" w:name="_Toc240232221"/>
       <w:r>
         <w:lastRenderedPageBreak/>
         <w:t>6. Requerimientos No Funcionales (RNF)</w:t>
       </w:r>
-      <w:bookmarkEnd w:id="6"/>
+      <w:bookmarkEnd w:id="5"/>
     </w:p>
     <w:p>
       <w:r>
@@ -10702,27 +10311,7 @@
           <w:szCs w:val="24"/>
           <w:lang w:eastAsia="es-CO"/>
         </w:rPr>
-        <w:t xml:space="preserve"> El sistema debe implementar autenticación (JWT/</w:t>
-      </w:r>
-      <w:proofErr w:type="spellStart"/>
-      <w:r>
-        <w:rPr>
-          <w:rFonts w:eastAsia="Times New Roman" w:cs="Times New Roman"/>
-          <w:color w:val="1F1F1F"/>
-          <w:szCs w:val="24"/>
-          <w:lang w:eastAsia="es-CO"/>
-        </w:rPr>
-        <w:t>OAuth</w:t>
-      </w:r>
-      <w:proofErr w:type="spellEnd"/>
-      <w:r>
-        <w:rPr>
-          <w:rFonts w:eastAsia="Times New Roman" w:cs="Times New Roman"/>
-          <w:color w:val="1F1F1F"/>
-          <w:szCs w:val="24"/>
-          <w:lang w:eastAsia="es-CO"/>
-        </w:rPr>
-        <w:t xml:space="preserve"> 2.0) y autorización por roles (RBAC), registrando cada acceso a información clínica de forma auditable.</w:t>
+        <w:t xml:space="preserve"> El sistema debe implementar autenticación (JWT/OAuth 2.0) y autorización por roles (RBAC), registrando cada acceso a información clínica de forma auditable.</w:t>
       </w:r>
     </w:p>
     <w:p>
@@ -10772,27 +10361,7 @@
           <w:szCs w:val="24"/>
           <w:lang w:eastAsia="es-CO"/>
         </w:rPr>
-        <w:t xml:space="preserve"> JWT/</w:t>
-      </w:r>
-      <w:proofErr w:type="spellStart"/>
-      <w:r>
-        <w:rPr>
-          <w:rFonts w:eastAsia="Times New Roman" w:cs="Times New Roman"/>
-          <w:color w:val="1F1F1F"/>
-          <w:szCs w:val="24"/>
-          <w:lang w:eastAsia="es-CO"/>
-        </w:rPr>
-        <w:t>OAuth</w:t>
-      </w:r>
-      <w:proofErr w:type="spellEnd"/>
-      <w:r>
-        <w:rPr>
-          <w:rFonts w:eastAsia="Times New Roman" w:cs="Times New Roman"/>
-          <w:color w:val="1F1F1F"/>
-          <w:szCs w:val="24"/>
-          <w:lang w:eastAsia="es-CO"/>
-        </w:rPr>
-        <w:t xml:space="preserve"> + RBAC + auditoría de accesos</w:t>
+        <w:t xml:space="preserve"> JWT/OAuth + RBAC + auditoría de accesos</w:t>
       </w:r>
     </w:p>
     <w:p>
@@ -10938,27 +10507,7 @@
           <w:szCs w:val="24"/>
           <w:lang w:eastAsia="es-CO"/>
         </w:rPr>
-        <w:t xml:space="preserve"> El tratamiento de datos personales de salud debe cumplir la normativa aplicable (en Colombia: Ley 1581/2012 y Resolución 1995/1999), garantizando consentimiento informado, minimización y </w:t>
-      </w:r>
-      <w:proofErr w:type="spellStart"/>
-      <w:r>
-        <w:rPr>
-          <w:rFonts w:eastAsia="Times New Roman" w:cs="Times New Roman"/>
-          <w:color w:val="1F1F1F"/>
-          <w:szCs w:val="24"/>
-          <w:lang w:eastAsia="es-CO"/>
-        </w:rPr>
-        <w:t>anonimización</w:t>
-      </w:r>
-      <w:proofErr w:type="spellEnd"/>
-      <w:r>
-        <w:rPr>
-          <w:rFonts w:eastAsia="Times New Roman" w:cs="Times New Roman"/>
-          <w:color w:val="1F1F1F"/>
-          <w:szCs w:val="24"/>
-          <w:lang w:eastAsia="es-CO"/>
-        </w:rPr>
-        <w:t xml:space="preserve"> para análisis.</w:t>
+        <w:t xml:space="preserve"> El tratamiento de datos personales de salud debe cumplir la normativa aplicable (en Colombia: Ley 1581/2012 y Resolución 1995/1999), garantizando consentimiento informado, minimización y anonimización para análisis.</w:t>
       </w:r>
     </w:p>
     <w:p>
@@ -11527,27 +11076,7 @@
           <w:szCs w:val="24"/>
           <w:lang w:eastAsia="es-CO"/>
         </w:rPr>
-        <w:t xml:space="preserve"> Cada transacción clínica debe registrarse de forma inmutable (</w:t>
-      </w:r>
-      <w:proofErr w:type="spellStart"/>
-      <w:r>
-        <w:rPr>
-          <w:rFonts w:eastAsia="Times New Roman" w:cs="Times New Roman"/>
-          <w:color w:val="1F1F1F"/>
-          <w:szCs w:val="24"/>
-          <w:lang w:eastAsia="es-CO"/>
-        </w:rPr>
-        <w:t>blockchain</w:t>
-      </w:r>
-      <w:proofErr w:type="spellEnd"/>
-      <w:r>
-        <w:rPr>
-          <w:rFonts w:eastAsia="Times New Roman" w:cs="Times New Roman"/>
-          <w:color w:val="1F1F1F"/>
-          <w:szCs w:val="24"/>
-          <w:lang w:eastAsia="es-CO"/>
-        </w:rPr>
-        <w:t>) y verificable; la verificación de integridad de un documento debe ser automática y auditable.</w:t>
+        <w:t xml:space="preserve"> Cada transacción clínica debe registrarse de forma inmutable (blockchain) y verificable; la verificación de integridad de un documento debe ser automática y auditable.</w:t>
       </w:r>
     </w:p>
     <w:p>
@@ -12140,27 +11669,7 @@
           <w:szCs w:val="24"/>
           <w:lang w:eastAsia="es-CO"/>
         </w:rPr>
-        <w:t xml:space="preserve">), </w:t>
-      </w:r>
-      <w:proofErr w:type="spellStart"/>
-      <w:r>
-        <w:rPr>
-          <w:rFonts w:eastAsia="Times New Roman" w:cs="Times New Roman"/>
-          <w:color w:val="1F1F1F"/>
-          <w:szCs w:val="24"/>
-          <w:lang w:eastAsia="es-CO"/>
-        </w:rPr>
-        <w:t>logs</w:t>
-      </w:r>
-      <w:proofErr w:type="spellEnd"/>
-      <w:r>
-        <w:rPr>
-          <w:rFonts w:eastAsia="Times New Roman" w:cs="Times New Roman"/>
-          <w:color w:val="1F1F1F"/>
-          <w:szCs w:val="24"/>
-          <w:lang w:eastAsia="es-CO"/>
-        </w:rPr>
-        <w:t xml:space="preserve"> estructurados y pruebas automatizadas; las actualizaciones deben desplegarse sin interrumpir el servicio.</w:t>
+        <w:t>), logs estructurados y pruebas automatizadas; las actualizaciones deben desplegarse sin interrumpir el servicio.</w:t>
       </w:r>
     </w:p>
     <w:p>
@@ -12423,27 +11932,7 @@
           <w:szCs w:val="24"/>
           <w:lang w:eastAsia="es-CO"/>
         </w:rPr>
-        <w:t xml:space="preserve"> como servicio, </w:t>
-      </w:r>
-      <w:proofErr w:type="spellStart"/>
-      <w:r>
-        <w:rPr>
-          <w:rFonts w:eastAsia="Times New Roman" w:cs="Times New Roman"/>
-          <w:color w:val="1F1F1F"/>
-          <w:szCs w:val="24"/>
-          <w:lang w:eastAsia="es-CO"/>
-        </w:rPr>
-        <w:t>MongoDB</w:t>
-      </w:r>
-      <w:proofErr w:type="spellEnd"/>
-      <w:r>
-        <w:rPr>
-          <w:rFonts w:eastAsia="Times New Roman" w:cs="Times New Roman"/>
-          <w:color w:val="1F1F1F"/>
-          <w:szCs w:val="24"/>
-          <w:lang w:eastAsia="es-CO"/>
-        </w:rPr>
-        <w:t xml:space="preserve"> administrado).</w:t>
+        <w:t xml:space="preserve"> como servicio, MongoDB administrado).</w:t>
       </w:r>
     </w:p>
     <w:p>
@@ -12537,27 +12026,7 @@
           <w:szCs w:val="24"/>
           <w:lang w:eastAsia="es-CO"/>
         </w:rPr>
-        <w:t xml:space="preserve">, </w:t>
-      </w:r>
-      <w:proofErr w:type="spellStart"/>
-      <w:r>
-        <w:rPr>
-          <w:rFonts w:eastAsia="Times New Roman" w:cs="Times New Roman"/>
-          <w:color w:val="1F1F1F"/>
-          <w:szCs w:val="24"/>
-          <w:lang w:eastAsia="es-CO"/>
-        </w:rPr>
-        <w:t>Render</w:t>
-      </w:r>
-      <w:proofErr w:type="spellEnd"/>
-      <w:r>
-        <w:rPr>
-          <w:rFonts w:eastAsia="Times New Roman" w:cs="Times New Roman"/>
-          <w:color w:val="1F1F1F"/>
-          <w:szCs w:val="24"/>
-          <w:lang w:eastAsia="es-CO"/>
-        </w:rPr>
-        <w:t>, Atlas)</w:t>
+        <w:t>, Render, Atlas)</w:t>
       </w:r>
     </w:p>
     <w:p>
@@ -12779,6 +12248,84 @@
         </w:rPr>
         <w:t>)</w:t>
       </w:r>
+      <w:r>
+        <w:rPr>
+          <w:rFonts w:eastAsia="Times New Roman" w:cs="Times New Roman"/>
+          <w:color w:val="1F1F1F"/>
+          <w:szCs w:val="24"/>
+          <w:lang w:eastAsia="es-CO"/>
+        </w:rPr>
+        <w:br/>
+      </w:r>
+      <w:r>
+        <w:rPr>
+          <w:rFonts w:eastAsia="Times New Roman" w:cs="Times New Roman"/>
+          <w:color w:val="1F1F1F"/>
+          <w:szCs w:val="24"/>
+          <w:lang w:eastAsia="es-CO"/>
+        </w:rPr>
+        <w:br/>
+      </w:r>
+      <w:r>
+        <w:rPr>
+          <w:rFonts w:eastAsia="Times New Roman" w:cs="Times New Roman"/>
+          <w:color w:val="1F1F1F"/>
+          <w:szCs w:val="24"/>
+          <w:lang w:eastAsia="es-CO"/>
+        </w:rPr>
+        <w:br/>
+      </w:r>
+      <w:r>
+        <w:rPr>
+          <w:rStyle w:val="Ttulo2Car"/>
+          <w:lang w:eastAsia="es-CO"/>
+        </w:rPr>
+        <w:t>Link Diseño Stitch:</w:t>
+      </w:r>
+      <w:r>
+        <w:rPr>
+          <w:rFonts w:eastAsia="Times New Roman" w:cs="Times New Roman"/>
+          <w:color w:val="1F1F1F"/>
+          <w:szCs w:val="24"/>
+          <w:lang w:eastAsia="es-CO"/>
+        </w:rPr>
+        <w:br/>
+      </w:r>
+      <w:hyperlink r:id="rId6" w:history="1">
+        <w:r>
+          <w:rPr>
+            <w:rStyle w:val="Hipervnculo"/>
+            <w:rFonts w:eastAsia="Times New Roman" w:cs="Times New Roman"/>
+            <w:szCs w:val="24"/>
+            <w:lang w:eastAsia="es-CO"/>
+          </w:rPr>
+          <w:t>https://stitch.withgoogle.com/projects/14801200049868007889</w:t>
+        </w:r>
+      </w:hyperlink>
+    </w:p>
+    <w:p>
+      <w:pPr>
+        <w:spacing w:before="100" w:beforeAutospacing="1" w:after="0" w:line="240" w:lineRule="auto"/>
+        <w:ind w:firstLine="0"/>
+        <w:rPr>
+          <w:rFonts w:eastAsia="Times New Roman" w:cs="Times New Roman"/>
+          <w:color w:val="1F1F1F"/>
+          <w:szCs w:val="24"/>
+          <w:lang w:eastAsia="es-CO"/>
+        </w:rPr>
+      </w:pPr>
+    </w:p>
+    <w:p>
+      <w:pPr>
+        <w:spacing w:before="100" w:beforeAutospacing="1" w:after="0" w:line="240" w:lineRule="auto"/>
+        <w:ind w:firstLine="0"/>
+        <w:rPr>
+          <w:rFonts w:eastAsia="Times New Roman" w:cs="Times New Roman"/>
+          <w:color w:val="1F1F1F"/>
+          <w:szCs w:val="24"/>
+          <w:lang w:eastAsia="es-CO"/>
+        </w:rPr>
+      </w:pPr>
     </w:p>
     <w:p/>
     <w:p>
@@ -12797,8 +12344,8 @@
 </file>
 
 <file path=word/numbering.xml><?xml version="1.0" encoding="utf-8"?>
-<w:numbering xmlns:wpc="http://schemas.microsoft.com/office/word/2010/wordprocessingCanvas" xmlns:mc="http://schemas.openxmlformats.org/markup-compatibility/2006" xmlns:o="urn:schemas-microsoft-com:office:office" xmlns:r="http://schemas.openxmlformats.org/officeDocument/2006/relationships" xmlns:m="http://schemas.openxmlformats.org/officeDocument/2006/math" xmlns:v="urn:schemas-microsoft-com:vml" xmlns:wp14="http://schemas.microsoft.com/office/word/2010/wordprocessingDrawing" xmlns:wp="http://schemas.openxmlformats.org/drawingml/2006/wordprocessingDrawing" xmlns:w10="urn:schemas-microsoft-com:office:word" xmlns:w="http://schemas.openxmlformats.org/wordprocessingml/2006/main" xmlns:w14="http://schemas.microsoft.com/office/word/2010/wordml" xmlns:w15="http://schemas.microsoft.com/office/word/2012/wordml" xmlns:wpg="http://schemas.microsoft.com/office/word/2010/wordprocessingGroup" xmlns:wpi="http://schemas.microsoft.com/office/word/2010/wordprocessingInk" xmlns:wne="http://schemas.microsoft.com/office/word/2006/wordml" xmlns:wps="http://schemas.microsoft.com/office/word/2010/wordprocessingShape" mc:Ignorable="w14 w15 wp14">
-  <w:abstractNum w:abstractNumId="0">
+<w:numbering xmlns:wpc="http://schemas.microsoft.com/office/word/2010/wordprocessingCanvas" xmlns:cx="http://schemas.microsoft.com/office/drawing/2014/chartex" xmlns:cx1="http://schemas.microsoft.com/office/drawing/2015/9/8/chartex" xmlns:cx2="http://schemas.microsoft.com/office/drawing/2015/10/21/chartex" xmlns:cx3="http://schemas.microsoft.com/office/drawing/2016/5/9/chartex" xmlns:cx4="http://schemas.microsoft.com/office/drawing/2016/5/10/chartex" xmlns:cx5="http://schemas.microsoft.com/office/drawing/2016/5/11/chartex" xmlns:cx6="http://schemas.microsoft.com/office/drawing/2016/5/12/chartex" xmlns:cx7="http://schemas.microsoft.com/office/drawing/2016/5/13/chartex" xmlns:cx8="http://schemas.microsoft.com/office/drawing/2016/5/14/chartex" xmlns:mc="http://schemas.openxmlformats.org/markup-compatibility/2006" xmlns:aink="http://schemas.microsoft.com/office/drawing/2016/ink" xmlns:am3d="http://schemas.microsoft.com/office/drawing/2017/model3d" xmlns:o="urn:schemas-microsoft-com:office:office" xmlns:oel="http://schemas.microsoft.com/office/2019/extlst" xmlns:r="http://schemas.openxmlformats.org/officeDocument/2006/relationships" xmlns:m="http://schemas.openxmlformats.org/officeDocument/2006/math" xmlns:v="urn:schemas-microsoft-com:vml" xmlns:wp14="http://schemas.microsoft.com/office/word/2010/wordprocessingDrawing" xmlns:wp="http://schemas.openxmlformats.org/drawingml/2006/wordprocessingDrawing" xmlns:w10="urn:schemas-microsoft-com:office:word" xmlns:w="http://schemas.openxmlformats.org/wordprocessingml/2006/main" xmlns:w14="http://schemas.microsoft.com/office/word/2010/wordml" xmlns:w15="http://schemas.microsoft.com/office/word/2012/wordml" xmlns:w16cex="http://schemas.microsoft.com/office/word/2018/wordml/cex" xmlns:w16cid="http://schemas.microsoft.com/office/word/2016/wordml/cid" xmlns:w16="http://schemas.microsoft.com/office/word/2018/wordml" xmlns:w16du="http://schemas.microsoft.com/office/word/2023/wordml/word16du" xmlns:w16sdtdh="http://schemas.microsoft.com/office/word/2020/wordml/sdtdatahash" xmlns:w16sdtfl="http://schemas.microsoft.com/office/word/2024/wordml/sdtformatlock" xmlns:w16se="http://schemas.microsoft.com/office/word/2015/wordml/symex" xmlns:wpg="http://schemas.microsoft.com/office/word/2010/wordprocessingGroup" xmlns:wpi="http://schemas.microsoft.com/office/word/2010/wordprocessingInk" xmlns:wne="http://schemas.microsoft.com/office/word/2006/wordml" xmlns:wps="http://schemas.microsoft.com/office/word/2010/wordprocessingShape" mc:Ignorable="w14 w15 w16se w16cid w16 w16cex w16sdtdh w16sdtfl w16du wp14">
+  <w:abstractNum w:abstractNumId="0" w15:restartNumberingAfterBreak="0">
     <w:nsid w:val="FFFFFF7E"/>
     <w:multiLevelType w:val="singleLevel"/>
     <w:tmpl w:val="FB12693A"/>
@@ -12816,7 +12363,7 @@
       </w:pPr>
     </w:lvl>
   </w:abstractNum>
-  <w:abstractNum w:abstractNumId="1">
+  <w:abstractNum w:abstractNumId="1" w15:restartNumberingAfterBreak="0">
     <w:nsid w:val="FFFFFF7F"/>
     <w:multiLevelType w:val="singleLevel"/>
     <w:tmpl w:val="38441652"/>
@@ -12834,7 +12381,7 @@
       </w:pPr>
     </w:lvl>
   </w:abstractNum>
-  <w:abstractNum w:abstractNumId="2">
+  <w:abstractNum w:abstractNumId="2" w15:restartNumberingAfterBreak="0">
     <w:nsid w:val="FFFFFF82"/>
     <w:multiLevelType w:val="singleLevel"/>
     <w:tmpl w:val="F3EAFDEC"/>
@@ -12855,7 +12402,7 @@
       </w:rPr>
     </w:lvl>
   </w:abstractNum>
-  <w:abstractNum w:abstractNumId="3">
+  <w:abstractNum w:abstractNumId="3" w15:restartNumberingAfterBreak="0">
     <w:nsid w:val="FFFFFF83"/>
     <w:multiLevelType w:val="singleLevel"/>
     <w:tmpl w:val="3D1EFFD4"/>
@@ -12876,7 +12423,7 @@
       </w:rPr>
     </w:lvl>
   </w:abstractNum>
-  <w:abstractNum w:abstractNumId="4">
+  <w:abstractNum w:abstractNumId="4" w15:restartNumberingAfterBreak="0">
     <w:nsid w:val="FFFFFF88"/>
     <w:multiLevelType w:val="singleLevel"/>
     <w:tmpl w:val="D0A62B40"/>
@@ -12894,7 +12441,7 @@
       </w:pPr>
     </w:lvl>
   </w:abstractNum>
-  <w:abstractNum w:abstractNumId="5">
+  <w:abstractNum w:abstractNumId="5" w15:restartNumberingAfterBreak="0">
     <w:nsid w:val="FFFFFF89"/>
     <w:multiLevelType w:val="singleLevel"/>
     <w:tmpl w:val="29761A62"/>
@@ -12915,7 +12462,7 @@
       </w:rPr>
     </w:lvl>
   </w:abstractNum>
-  <w:abstractNum w:abstractNumId="6">
+  <w:abstractNum w:abstractNumId="6" w15:restartNumberingAfterBreak="0">
     <w:nsid w:val="00462B8C"/>
     <w:multiLevelType w:val="multilevel"/>
     <w:tmpl w:val="AE7EAC9A"/>
@@ -13064,7 +12611,7 @@
       </w:rPr>
     </w:lvl>
   </w:abstractNum>
-  <w:abstractNum w:abstractNumId="7">
+  <w:abstractNum w:abstractNumId="7" w15:restartNumberingAfterBreak="0">
     <w:nsid w:val="02967373"/>
     <w:multiLevelType w:val="multilevel"/>
     <w:tmpl w:val="B4BE62E8"/>
@@ -13213,7 +12760,7 @@
       </w:rPr>
     </w:lvl>
   </w:abstractNum>
-  <w:abstractNum w:abstractNumId="8">
+  <w:abstractNum w:abstractNumId="8" w15:restartNumberingAfterBreak="0">
     <w:nsid w:val="061620B1"/>
     <w:multiLevelType w:val="multilevel"/>
     <w:tmpl w:val="B60A36B2"/>
@@ -13362,7 +12909,7 @@
       </w:rPr>
     </w:lvl>
   </w:abstractNum>
-  <w:abstractNum w:abstractNumId="9">
+  <w:abstractNum w:abstractNumId="9" w15:restartNumberingAfterBreak="0">
     <w:nsid w:val="14842FA9"/>
     <w:multiLevelType w:val="multilevel"/>
     <w:tmpl w:val="5748F426"/>
@@ -13511,7 +13058,7 @@
       </w:rPr>
     </w:lvl>
   </w:abstractNum>
-  <w:abstractNum w:abstractNumId="10">
+  <w:abstractNum w:abstractNumId="10" w15:restartNumberingAfterBreak="0">
     <w:nsid w:val="159E7B98"/>
     <w:multiLevelType w:val="multilevel"/>
     <w:tmpl w:val="A358FA6E"/>
@@ -13660,7 +13207,7 @@
       </w:rPr>
     </w:lvl>
   </w:abstractNum>
-  <w:abstractNum w:abstractNumId="11">
+  <w:abstractNum w:abstractNumId="11" w15:restartNumberingAfterBreak="0">
     <w:nsid w:val="19452CAB"/>
     <w:multiLevelType w:val="multilevel"/>
     <w:tmpl w:val="C6AC2E50"/>
@@ -13809,7 +13356,7 @@
       </w:rPr>
     </w:lvl>
   </w:abstractNum>
-  <w:abstractNum w:abstractNumId="12">
+  <w:abstractNum w:abstractNumId="12" w15:restartNumberingAfterBreak="0">
     <w:nsid w:val="1A6A139D"/>
     <w:multiLevelType w:val="multilevel"/>
     <w:tmpl w:val="2C80709E"/>
@@ -13958,7 +13505,7 @@
       </w:rPr>
     </w:lvl>
   </w:abstractNum>
-  <w:abstractNum w:abstractNumId="13">
+  <w:abstractNum w:abstractNumId="13" w15:restartNumberingAfterBreak="0">
     <w:nsid w:val="1C01029B"/>
     <w:multiLevelType w:val="multilevel"/>
     <w:tmpl w:val="53985FAE"/>
@@ -14107,7 +13654,7 @@
       </w:rPr>
     </w:lvl>
   </w:abstractNum>
-  <w:abstractNum w:abstractNumId="14">
+  <w:abstractNum w:abstractNumId="14" w15:restartNumberingAfterBreak="0">
     <w:nsid w:val="1D601E83"/>
     <w:multiLevelType w:val="multilevel"/>
     <w:tmpl w:val="642C50BE"/>
@@ -14256,7 +13803,7 @@
       </w:rPr>
     </w:lvl>
   </w:abstractNum>
-  <w:abstractNum w:abstractNumId="15">
+  <w:abstractNum w:abstractNumId="15" w15:restartNumberingAfterBreak="0">
     <w:nsid w:val="1E6676B1"/>
     <w:multiLevelType w:val="multilevel"/>
     <w:tmpl w:val="75AE1156"/>
@@ -14405,7 +13952,7 @@
       </w:rPr>
     </w:lvl>
   </w:abstractNum>
-  <w:abstractNum w:abstractNumId="16">
+  <w:abstractNum w:abstractNumId="16" w15:restartNumberingAfterBreak="0">
     <w:nsid w:val="20854EB0"/>
     <w:multiLevelType w:val="multilevel"/>
     <w:tmpl w:val="0D282A6E"/>
@@ -14554,7 +14101,7 @@
       </w:rPr>
     </w:lvl>
   </w:abstractNum>
-  <w:abstractNum w:abstractNumId="17">
+  <w:abstractNum w:abstractNumId="17" w15:restartNumberingAfterBreak="0">
     <w:nsid w:val="20CC6FFA"/>
     <w:multiLevelType w:val="multilevel"/>
     <w:tmpl w:val="4D5AE3DE"/>
@@ -14703,7 +14250,7 @@
       </w:rPr>
     </w:lvl>
   </w:abstractNum>
-  <w:abstractNum w:abstractNumId="18">
+  <w:abstractNum w:abstractNumId="18" w15:restartNumberingAfterBreak="0">
     <w:nsid w:val="22BE1370"/>
     <w:multiLevelType w:val="multilevel"/>
     <w:tmpl w:val="D1FEB830"/>
@@ -14852,7 +14399,7 @@
       </w:rPr>
     </w:lvl>
   </w:abstractNum>
-  <w:abstractNum w:abstractNumId="19">
+  <w:abstractNum w:abstractNumId="19" w15:restartNumberingAfterBreak="0">
     <w:nsid w:val="272026E3"/>
     <w:multiLevelType w:val="multilevel"/>
     <w:tmpl w:val="20C6A97C"/>
@@ -15001,7 +14548,7 @@
       </w:rPr>
     </w:lvl>
   </w:abstractNum>
-  <w:abstractNum w:abstractNumId="20">
+  <w:abstractNum w:abstractNumId="20" w15:restartNumberingAfterBreak="0">
     <w:nsid w:val="283C348D"/>
     <w:multiLevelType w:val="multilevel"/>
     <w:tmpl w:val="846A660A"/>
@@ -15150,7 +14697,7 @@
       </w:rPr>
     </w:lvl>
   </w:abstractNum>
-  <w:abstractNum w:abstractNumId="21">
+  <w:abstractNum w:abstractNumId="21" w15:restartNumberingAfterBreak="0">
     <w:nsid w:val="2A734A07"/>
     <w:multiLevelType w:val="multilevel"/>
     <w:tmpl w:val="462A36B6"/>
@@ -15299,7 +14846,7 @@
       </w:rPr>
     </w:lvl>
   </w:abstractNum>
-  <w:abstractNum w:abstractNumId="22">
+  <w:abstractNum w:abstractNumId="22" w15:restartNumberingAfterBreak="0">
     <w:nsid w:val="2C451354"/>
     <w:multiLevelType w:val="multilevel"/>
     <w:tmpl w:val="436C08AC"/>
@@ -15448,7 +14995,7 @@
       </w:rPr>
     </w:lvl>
   </w:abstractNum>
-  <w:abstractNum w:abstractNumId="23">
+  <w:abstractNum w:abstractNumId="23" w15:restartNumberingAfterBreak="0">
     <w:nsid w:val="2C6A0EBA"/>
     <w:multiLevelType w:val="multilevel"/>
     <w:tmpl w:val="5782AEFA"/>
@@ -15597,7 +15144,7 @@
       </w:rPr>
     </w:lvl>
   </w:abstractNum>
-  <w:abstractNum w:abstractNumId="24">
+  <w:abstractNum w:abstractNumId="24" w15:restartNumberingAfterBreak="0">
     <w:nsid w:val="318F7A62"/>
     <w:multiLevelType w:val="multilevel"/>
     <w:tmpl w:val="B37074A4"/>
@@ -15746,7 +15293,7 @@
       </w:rPr>
     </w:lvl>
   </w:abstractNum>
-  <w:abstractNum w:abstractNumId="25">
+  <w:abstractNum w:abstractNumId="25" w15:restartNumberingAfterBreak="0">
     <w:nsid w:val="33FC0540"/>
     <w:multiLevelType w:val="multilevel"/>
     <w:tmpl w:val="29AC34BC"/>
@@ -15895,7 +15442,7 @@
       </w:rPr>
     </w:lvl>
   </w:abstractNum>
-  <w:abstractNum w:abstractNumId="26">
+  <w:abstractNum w:abstractNumId="26" w15:restartNumberingAfterBreak="0">
     <w:nsid w:val="3DE779A8"/>
     <w:multiLevelType w:val="multilevel"/>
     <w:tmpl w:val="E24AD6F8"/>
@@ -16044,7 +15591,7 @@
       </w:rPr>
     </w:lvl>
   </w:abstractNum>
-  <w:abstractNum w:abstractNumId="27">
+  <w:abstractNum w:abstractNumId="27" w15:restartNumberingAfterBreak="0">
     <w:nsid w:val="4457089A"/>
     <w:multiLevelType w:val="multilevel"/>
     <w:tmpl w:val="7242A76A"/>
@@ -16193,7 +15740,7 @@
       </w:rPr>
     </w:lvl>
   </w:abstractNum>
-  <w:abstractNum w:abstractNumId="28">
+  <w:abstractNum w:abstractNumId="28" w15:restartNumberingAfterBreak="0">
     <w:nsid w:val="47EB4154"/>
     <w:multiLevelType w:val="multilevel"/>
     <w:tmpl w:val="F7FE4BC8"/>
@@ -16342,7 +15889,7 @@
       </w:rPr>
     </w:lvl>
   </w:abstractNum>
-  <w:abstractNum w:abstractNumId="29">
+  <w:abstractNum w:abstractNumId="29" w15:restartNumberingAfterBreak="0">
     <w:nsid w:val="495F7E84"/>
     <w:multiLevelType w:val="multilevel"/>
     <w:tmpl w:val="E444C872"/>
@@ -16491,7 +16038,7 @@
       </w:rPr>
     </w:lvl>
   </w:abstractNum>
-  <w:abstractNum w:abstractNumId="30">
+  <w:abstractNum w:abstractNumId="30" w15:restartNumberingAfterBreak="0">
     <w:nsid w:val="49D54528"/>
     <w:multiLevelType w:val="multilevel"/>
     <w:tmpl w:val="9EA6EBB6"/>
@@ -16640,7 +16187,7 @@
       </w:rPr>
     </w:lvl>
   </w:abstractNum>
-  <w:abstractNum w:abstractNumId="31">
+  <w:abstractNum w:abstractNumId="31" w15:restartNumberingAfterBreak="0">
     <w:nsid w:val="4AAB3CD9"/>
     <w:multiLevelType w:val="multilevel"/>
     <w:tmpl w:val="FFF055A0"/>
@@ -16789,7 +16336,7 @@
       </w:rPr>
     </w:lvl>
   </w:abstractNum>
-  <w:abstractNum w:abstractNumId="32">
+  <w:abstractNum w:abstractNumId="32" w15:restartNumberingAfterBreak="0">
     <w:nsid w:val="50DF3C36"/>
     <w:multiLevelType w:val="multilevel"/>
     <w:tmpl w:val="44221B62"/>
@@ -16938,7 +16485,7 @@
       </w:rPr>
     </w:lvl>
   </w:abstractNum>
-  <w:abstractNum w:abstractNumId="33">
+  <w:abstractNum w:abstractNumId="33" w15:restartNumberingAfterBreak="0">
     <w:nsid w:val="51A73520"/>
     <w:multiLevelType w:val="multilevel"/>
     <w:tmpl w:val="818AF104"/>
@@ -17087,7 +16634,7 @@
       </w:rPr>
     </w:lvl>
   </w:abstractNum>
-  <w:abstractNum w:abstractNumId="34">
+  <w:abstractNum w:abstractNumId="34" w15:restartNumberingAfterBreak="0">
     <w:nsid w:val="52304090"/>
     <w:multiLevelType w:val="multilevel"/>
     <w:tmpl w:val="0BCC161A"/>
@@ -17236,7 +16783,7 @@
       </w:rPr>
     </w:lvl>
   </w:abstractNum>
-  <w:abstractNum w:abstractNumId="35">
+  <w:abstractNum w:abstractNumId="35" w15:restartNumberingAfterBreak="0">
     <w:nsid w:val="534F4D95"/>
     <w:multiLevelType w:val="multilevel"/>
     <w:tmpl w:val="02AE34BC"/>
@@ -17385,7 +16932,7 @@
       </w:rPr>
     </w:lvl>
   </w:abstractNum>
-  <w:abstractNum w:abstractNumId="36">
+  <w:abstractNum w:abstractNumId="36" w15:restartNumberingAfterBreak="0">
     <w:nsid w:val="54674B45"/>
     <w:multiLevelType w:val="multilevel"/>
     <w:tmpl w:val="BB7AB93A"/>
@@ -17534,7 +17081,7 @@
       </w:rPr>
     </w:lvl>
   </w:abstractNum>
-  <w:abstractNum w:abstractNumId="37">
+  <w:abstractNum w:abstractNumId="37" w15:restartNumberingAfterBreak="0">
     <w:nsid w:val="5CCB1A3A"/>
     <w:multiLevelType w:val="multilevel"/>
     <w:tmpl w:val="956CF774"/>
@@ -17683,7 +17230,7 @@
       </w:rPr>
     </w:lvl>
   </w:abstractNum>
-  <w:abstractNum w:abstractNumId="38">
+  <w:abstractNum w:abstractNumId="38" w15:restartNumberingAfterBreak="0">
     <w:nsid w:val="5E3844A4"/>
     <w:multiLevelType w:val="multilevel"/>
     <w:tmpl w:val="3A0A0136"/>
@@ -17832,7 +17379,7 @@
       </w:rPr>
     </w:lvl>
   </w:abstractNum>
-  <w:abstractNum w:abstractNumId="39">
+  <w:abstractNum w:abstractNumId="39" w15:restartNumberingAfterBreak="0">
     <w:nsid w:val="606D124F"/>
     <w:multiLevelType w:val="multilevel"/>
     <w:tmpl w:val="2174D1C0"/>
@@ -17981,7 +17528,7 @@
       </w:rPr>
     </w:lvl>
   </w:abstractNum>
-  <w:abstractNum w:abstractNumId="40">
+  <w:abstractNum w:abstractNumId="40" w15:restartNumberingAfterBreak="0">
     <w:nsid w:val="657A440D"/>
     <w:multiLevelType w:val="multilevel"/>
     <w:tmpl w:val="D7185BB4"/>
@@ -18130,7 +17677,7 @@
       </w:rPr>
     </w:lvl>
   </w:abstractNum>
-  <w:abstractNum w:abstractNumId="41">
+  <w:abstractNum w:abstractNumId="41" w15:restartNumberingAfterBreak="0">
     <w:nsid w:val="6A1904EA"/>
     <w:multiLevelType w:val="multilevel"/>
     <w:tmpl w:val="51405426"/>
@@ -18279,7 +17826,7 @@
       </w:rPr>
     </w:lvl>
   </w:abstractNum>
-  <w:abstractNum w:abstractNumId="42">
+  <w:abstractNum w:abstractNumId="42" w15:restartNumberingAfterBreak="0">
     <w:nsid w:val="6C346120"/>
     <w:multiLevelType w:val="multilevel"/>
     <w:tmpl w:val="B9C2FF42"/>
@@ -18428,7 +17975,7 @@
       </w:rPr>
     </w:lvl>
   </w:abstractNum>
-  <w:abstractNum w:abstractNumId="43">
+  <w:abstractNum w:abstractNumId="43" w15:restartNumberingAfterBreak="0">
     <w:nsid w:val="70B17AD7"/>
     <w:multiLevelType w:val="multilevel"/>
     <w:tmpl w:val="9940A89A"/>
@@ -18577,7 +18124,7 @@
       </w:rPr>
     </w:lvl>
   </w:abstractNum>
-  <w:abstractNum w:abstractNumId="44">
+  <w:abstractNum w:abstractNumId="44" w15:restartNumberingAfterBreak="0">
     <w:nsid w:val="72C55331"/>
     <w:multiLevelType w:val="multilevel"/>
     <w:tmpl w:val="69B48862"/>
@@ -18726,7 +18273,7 @@
       </w:rPr>
     </w:lvl>
   </w:abstractNum>
-  <w:abstractNum w:abstractNumId="45">
+  <w:abstractNum w:abstractNumId="45" w15:restartNumberingAfterBreak="0">
     <w:nsid w:val="73DA3224"/>
     <w:multiLevelType w:val="multilevel"/>
     <w:tmpl w:val="BCE8A4FC"/>
@@ -18875,7 +18422,7 @@
       </w:rPr>
     </w:lvl>
   </w:abstractNum>
-  <w:abstractNum w:abstractNumId="46">
+  <w:abstractNum w:abstractNumId="46" w15:restartNumberingAfterBreak="0">
     <w:nsid w:val="753A7460"/>
     <w:multiLevelType w:val="multilevel"/>
     <w:tmpl w:val="9F0E87E8"/>
@@ -19024,7 +18571,7 @@
       </w:rPr>
     </w:lvl>
   </w:abstractNum>
-  <w:abstractNum w:abstractNumId="47">
+  <w:abstractNum w:abstractNumId="47" w15:restartNumberingAfterBreak="0">
     <w:nsid w:val="75C426A6"/>
     <w:multiLevelType w:val="multilevel"/>
     <w:tmpl w:val="CC4AD166"/>
@@ -19173,7 +18720,7 @@
       </w:rPr>
     </w:lvl>
   </w:abstractNum>
-  <w:abstractNum w:abstractNumId="48">
+  <w:abstractNum w:abstractNumId="48" w15:restartNumberingAfterBreak="0">
     <w:nsid w:val="767537CA"/>
     <w:multiLevelType w:val="multilevel"/>
     <w:tmpl w:val="F3C46DFA"/>
@@ -19322,7 +18869,7 @@
       </w:rPr>
     </w:lvl>
   </w:abstractNum>
-  <w:abstractNum w:abstractNumId="49">
+  <w:abstractNum w:abstractNumId="49" w15:restartNumberingAfterBreak="0">
     <w:nsid w:val="774F53C7"/>
     <w:multiLevelType w:val="multilevel"/>
     <w:tmpl w:val="9E301E24"/>
@@ -19471,7 +19018,7 @@
       </w:rPr>
     </w:lvl>
   </w:abstractNum>
-  <w:abstractNum w:abstractNumId="50">
+  <w:abstractNum w:abstractNumId="50" w15:restartNumberingAfterBreak="0">
     <w:nsid w:val="77D20632"/>
     <w:multiLevelType w:val="multilevel"/>
     <w:tmpl w:val="9D0C63D4"/>
@@ -19620,7 +19167,7 @@
       </w:rPr>
     </w:lvl>
   </w:abstractNum>
-  <w:abstractNum w:abstractNumId="51">
+  <w:abstractNum w:abstractNumId="51" w15:restartNumberingAfterBreak="0">
     <w:nsid w:val="77D73659"/>
     <w:multiLevelType w:val="multilevel"/>
     <w:tmpl w:val="85EC0D40"/>
@@ -19769,160 +19316,160 @@
       </w:rPr>
     </w:lvl>
   </w:abstractNum>
-  <w:num w:numId="1">
+  <w:num w:numId="1" w16cid:durableId="915746203">
     <w:abstractNumId w:val="5"/>
   </w:num>
-  <w:num w:numId="2">
+  <w:num w:numId="2" w16cid:durableId="917834964">
     <w:abstractNumId w:val="3"/>
   </w:num>
-  <w:num w:numId="3">
+  <w:num w:numId="3" w16cid:durableId="113984338">
     <w:abstractNumId w:val="2"/>
   </w:num>
-  <w:num w:numId="4">
+  <w:num w:numId="4" w16cid:durableId="867573090">
     <w:abstractNumId w:val="4"/>
   </w:num>
-  <w:num w:numId="5">
+  <w:num w:numId="5" w16cid:durableId="2021349213">
     <w:abstractNumId w:val="1"/>
   </w:num>
-  <w:num w:numId="6">
+  <w:num w:numId="6" w16cid:durableId="81147302">
     <w:abstractNumId w:val="0"/>
   </w:num>
-  <w:num w:numId="7">
+  <w:num w:numId="7" w16cid:durableId="916522815">
     <w:abstractNumId w:val="32"/>
   </w:num>
-  <w:num w:numId="8">
+  <w:num w:numId="8" w16cid:durableId="32652518">
     <w:abstractNumId w:val="43"/>
   </w:num>
-  <w:num w:numId="9">
+  <w:num w:numId="9" w16cid:durableId="1055155976">
     <w:abstractNumId w:val="40"/>
   </w:num>
-  <w:num w:numId="10">
+  <w:num w:numId="10" w16cid:durableId="1421560109">
     <w:abstractNumId w:val="31"/>
   </w:num>
-  <w:num w:numId="11">
+  <w:num w:numId="11" w16cid:durableId="52238763">
     <w:abstractNumId w:val="19"/>
   </w:num>
-  <w:num w:numId="12">
+  <w:num w:numId="12" w16cid:durableId="15468178">
     <w:abstractNumId w:val="34"/>
   </w:num>
-  <w:num w:numId="13">
+  <w:num w:numId="13" w16cid:durableId="1866363903">
     <w:abstractNumId w:val="22"/>
   </w:num>
-  <w:num w:numId="14">
+  <w:num w:numId="14" w16cid:durableId="253559078">
     <w:abstractNumId w:val="47"/>
   </w:num>
-  <w:num w:numId="15">
+  <w:num w:numId="15" w16cid:durableId="909924628">
     <w:abstractNumId w:val="48"/>
   </w:num>
-  <w:num w:numId="16">
+  <w:num w:numId="16" w16cid:durableId="1478035299">
     <w:abstractNumId w:val="26"/>
   </w:num>
-  <w:num w:numId="17">
+  <w:num w:numId="17" w16cid:durableId="931664636">
     <w:abstractNumId w:val="35"/>
   </w:num>
-  <w:num w:numId="18">
+  <w:num w:numId="18" w16cid:durableId="1726485388">
     <w:abstractNumId w:val="23"/>
   </w:num>
-  <w:num w:numId="19">
+  <w:num w:numId="19" w16cid:durableId="718826871">
     <w:abstractNumId w:val="12"/>
   </w:num>
-  <w:num w:numId="20">
+  <w:num w:numId="20" w16cid:durableId="2117480880">
     <w:abstractNumId w:val="42"/>
   </w:num>
-  <w:num w:numId="21">
+  <w:num w:numId="21" w16cid:durableId="742142286">
     <w:abstractNumId w:val="16"/>
   </w:num>
-  <w:num w:numId="22">
+  <w:num w:numId="22" w16cid:durableId="1005740485">
     <w:abstractNumId w:val="9"/>
   </w:num>
-  <w:num w:numId="23">
+  <w:num w:numId="23" w16cid:durableId="64768232">
     <w:abstractNumId w:val="49"/>
   </w:num>
-  <w:num w:numId="24">
+  <w:num w:numId="24" w16cid:durableId="1987272200">
     <w:abstractNumId w:val="39"/>
   </w:num>
-  <w:num w:numId="25">
+  <w:num w:numId="25" w16cid:durableId="876821949">
     <w:abstractNumId w:val="17"/>
   </w:num>
-  <w:num w:numId="26">
+  <w:num w:numId="26" w16cid:durableId="2080394615">
     <w:abstractNumId w:val="20"/>
   </w:num>
-  <w:num w:numId="27">
+  <w:num w:numId="27" w16cid:durableId="1275595800">
     <w:abstractNumId w:val="46"/>
   </w:num>
-  <w:num w:numId="28">
+  <w:num w:numId="28" w16cid:durableId="767432179">
     <w:abstractNumId w:val="14"/>
   </w:num>
-  <w:num w:numId="29">
+  <w:num w:numId="29" w16cid:durableId="1139154963">
     <w:abstractNumId w:val="6"/>
   </w:num>
-  <w:num w:numId="30">
+  <w:num w:numId="30" w16cid:durableId="1434521305">
     <w:abstractNumId w:val="11"/>
   </w:num>
-  <w:num w:numId="31">
+  <w:num w:numId="31" w16cid:durableId="1719471979">
     <w:abstractNumId w:val="10"/>
   </w:num>
-  <w:num w:numId="32">
+  <w:num w:numId="32" w16cid:durableId="1936786952">
     <w:abstractNumId w:val="51"/>
   </w:num>
-  <w:num w:numId="33">
+  <w:num w:numId="33" w16cid:durableId="1817844183">
     <w:abstractNumId w:val="29"/>
   </w:num>
-  <w:num w:numId="34">
+  <w:num w:numId="34" w16cid:durableId="1169440684">
     <w:abstractNumId w:val="18"/>
   </w:num>
-  <w:num w:numId="35">
+  <w:num w:numId="35" w16cid:durableId="1799832814">
     <w:abstractNumId w:val="27"/>
   </w:num>
-  <w:num w:numId="36">
+  <w:num w:numId="36" w16cid:durableId="535507812">
     <w:abstractNumId w:val="8"/>
   </w:num>
-  <w:num w:numId="37">
+  <w:num w:numId="37" w16cid:durableId="909116487">
     <w:abstractNumId w:val="30"/>
   </w:num>
-  <w:num w:numId="38">
+  <w:num w:numId="38" w16cid:durableId="1770198208">
     <w:abstractNumId w:val="15"/>
   </w:num>
-  <w:num w:numId="39">
+  <w:num w:numId="39" w16cid:durableId="309211863">
     <w:abstractNumId w:val="28"/>
   </w:num>
-  <w:num w:numId="40">
+  <w:num w:numId="40" w16cid:durableId="292487197">
     <w:abstractNumId w:val="37"/>
   </w:num>
-  <w:num w:numId="41">
+  <w:num w:numId="41" w16cid:durableId="1457481353">
     <w:abstractNumId w:val="45"/>
   </w:num>
-  <w:num w:numId="42">
+  <w:num w:numId="42" w16cid:durableId="312291930">
     <w:abstractNumId w:val="50"/>
   </w:num>
-  <w:num w:numId="43">
+  <w:num w:numId="43" w16cid:durableId="407850474">
     <w:abstractNumId w:val="21"/>
   </w:num>
-  <w:num w:numId="44">
+  <w:num w:numId="44" w16cid:durableId="741947704">
     <w:abstractNumId w:val="13"/>
   </w:num>
-  <w:num w:numId="45">
+  <w:num w:numId="45" w16cid:durableId="709064721">
     <w:abstractNumId w:val="7"/>
   </w:num>
-  <w:num w:numId="46">
+  <w:num w:numId="46" w16cid:durableId="1203056554">
     <w:abstractNumId w:val="41"/>
   </w:num>
-  <w:num w:numId="47">
+  <w:num w:numId="47" w16cid:durableId="2090230101">
     <w:abstractNumId w:val="38"/>
   </w:num>
-  <w:num w:numId="48">
+  <w:num w:numId="48" w16cid:durableId="376319944">
     <w:abstractNumId w:val="44"/>
   </w:num>
-  <w:num w:numId="49">
+  <w:num w:numId="49" w16cid:durableId="1153717947">
     <w:abstractNumId w:val="33"/>
   </w:num>
-  <w:num w:numId="50">
+  <w:num w:numId="50" w16cid:durableId="2004894014">
     <w:abstractNumId w:val="36"/>
   </w:num>
-  <w:num w:numId="51">
+  <w:num w:numId="51" w16cid:durableId="1114790522">
     <w:abstractNumId w:val="25"/>
   </w:num>
-  <w:num w:numId="52">
+  <w:num w:numId="52" w16cid:durableId="995649609">
     <w:abstractNumId w:val="24"/>
   </w:num>
   <w:numIdMacAtCleanup w:val="52"/>
@@ -19930,7 +19477,7 @@
 </file>
 
 <file path=word/styles.xml><?xml version="1.0" encoding="utf-8"?>
-<w:styles xmlns:mc="http://schemas.openxmlformats.org/markup-compatibility/2006" xmlns:r="http://schemas.openxmlformats.org/officeDocument/2006/relationships" xmlns:w="http://schemas.openxmlformats.org/wordprocessingml/2006/main" xmlns:w14="http://schemas.microsoft.com/office/word/2010/wordml" xmlns:w15="http://schemas.microsoft.com/office/word/2012/wordml" mc:Ignorable="w14 w15">
+<w:styles xmlns:mc="http://schemas.openxmlformats.org/markup-compatibility/2006" xmlns:r="http://schemas.openxmlformats.org/officeDocument/2006/relationships" xmlns:w="http://schemas.openxmlformats.org/wordprocessingml/2006/main" xmlns:w14="http://schemas.microsoft.com/office/word/2010/wordml" xmlns:w15="http://schemas.microsoft.com/office/word/2012/wordml" xmlns:w16cex="http://schemas.microsoft.com/office/word/2018/wordml/cex" xmlns:w16cid="http://schemas.microsoft.com/office/word/2016/wordml/cid" xmlns:w16="http://schemas.microsoft.com/office/word/2018/wordml" xmlns:w16du="http://schemas.microsoft.com/office/word/2023/wordml/word16du" xmlns:w16sdtdh="http://schemas.microsoft.com/office/word/2020/wordml/sdtdatahash" xmlns:w16sdtfl="http://schemas.microsoft.com/office/word/2024/wordml/sdtformatlock" xmlns:w16se="http://schemas.microsoft.com/office/word/2015/wordml/symex" mc:Ignorable="w14 w15 w16se w16cid w16 w16cex w16sdtdh w16sdtfl w16du">
   <w:docDefaults>
     <w:rPrDefault>
       <w:rPr>
@@ -19946,7 +19493,7 @@
       </w:pPr>
     </w:pPrDefault>
   </w:docDefaults>
-  <w:latentStyles w:defLockedState="0" w:defUIPriority="99" w:defSemiHidden="0" w:defUnhideWhenUsed="0" w:defQFormat="0" w:count="371">
+  <w:latentStyles w:defLockedState="0" w:defUIPriority="99" w:defSemiHidden="0" w:defUnhideWhenUsed="0" w:defQFormat="0" w:count="376">
     <w:lsdException w:name="Normal" w:uiPriority="0" w:qFormat="1"/>
     <w:lsdException w:name="heading 1" w:uiPriority="9" w:qFormat="1"/>
     <w:lsdException w:name="heading 2" w:semiHidden="1" w:uiPriority="9" w:unhideWhenUsed="1" w:qFormat="1"/>
@@ -20309,6 +19856,11 @@
     <w:lsdException w:name="List Table 5 Dark Accent 6" w:uiPriority="50"/>
     <w:lsdException w:name="List Table 6 Colorful Accent 6" w:uiPriority="51"/>
     <w:lsdException w:name="List Table 7 Colorful Accent 6" w:uiPriority="52"/>
+    <w:lsdException w:name="Mention" w:semiHidden="1" w:unhideWhenUsed="1"/>
+    <w:lsdException w:name="Smart Hyperlink" w:semiHidden="1" w:unhideWhenUsed="1"/>
+    <w:lsdException w:name="Hashtag" w:semiHidden="1" w:unhideWhenUsed="1"/>
+    <w:lsdException w:name="Unresolved Mention" w:semiHidden="1" w:unhideWhenUsed="1"/>
+    <w:lsdException w:name="Smart Link" w:semiHidden="1" w:unhideWhenUsed="1"/>
   </w:latentStyles>
   <w:style w:type="paragraph" w:default="1" w:styleId="Normal">
     <w:name w:val="Normal"/>
@@ -20657,11 +20209,11 @@
       <w:color w:val="4F81BD" w:themeColor="accent1"/>
     </w:rPr>
   </w:style>
-  <w:style w:type="paragraph" w:styleId="Puesto">
+  <w:style w:type="paragraph" w:styleId="Ttulo">
     <w:name w:val="Title"/>
     <w:basedOn w:val="Normal"/>
     <w:next w:val="Normal"/>
-    <w:link w:val="PuestoCar"/>
+    <w:link w:val="TtuloCar"/>
     <w:uiPriority w:val="10"/>
     <w:qFormat/>
     <w:rsid w:val="00FC693F"/>
@@ -20681,10 +20233,10 @@
       <w:szCs w:val="52"/>
     </w:rPr>
   </w:style>
-  <w:style w:type="character" w:customStyle="1" w:styleId="PuestoCar">
-    <w:name w:val="Puesto Car"/>
+  <w:style w:type="character" w:customStyle="1" w:styleId="TtuloCar">
+    <w:name w:val="Título Car"/>
     <w:basedOn w:val="Fuentedeprrafopredeter"/>
-    <w:link w:val="Puesto"/>
+    <w:link w:val="Ttulo"/>
     <w:uiPriority w:val="10"/>
     <w:rsid w:val="00FC693F"/>
     <w:rPr>
@@ -21122,7 +20674,7 @@
       <w:szCs w:val="18"/>
     </w:rPr>
   </w:style>
-  <w:style w:type="character" w:styleId="Textoennegrita">
+  <w:style w:type="character" w:styleId="Fuerte">
     <w:name w:val="Strong"/>
     <w:basedOn w:val="Fuentedeprrafopredeter"/>
     <w:uiPriority w:val="22"/>
@@ -21247,7 +20799,7 @@
       <w:spacing w:val="5"/>
     </w:rPr>
   </w:style>
-  <w:style w:type="paragraph" w:styleId="TtulodeTDC">
+  <w:style w:type="paragraph" w:styleId="TtuloTDC">
     <w:name w:val="TOC Heading"/>
     <w:basedOn w:val="Ttulo1"/>
     <w:next w:val="Normal"/>
@@ -21268,7 +20820,6 @@
       <w:spacing w:after="0" w:line="240" w:lineRule="auto"/>
     </w:pPr>
     <w:tblPr>
-      <w:tblInd w:w="0" w:type="dxa"/>
       <w:tblBorders>
         <w:top w:val="single" w:sz="4" w:space="0" w:color="auto"/>
         <w:left w:val="single" w:sz="4" w:space="0" w:color="auto"/>
@@ -21277,12 +20828,6 @@
         <w:insideH w:val="single" w:sz="4" w:space="0" w:color="auto"/>
         <w:insideV w:val="single" w:sz="4" w:space="0" w:color="auto"/>
       </w:tblBorders>
-      <w:tblCellMar>
-        <w:top w:w="0" w:type="dxa"/>
-        <w:left w:w="108" w:type="dxa"/>
-        <w:bottom w:w="0" w:type="dxa"/>
-        <w:right w:w="108" w:type="dxa"/>
-      </w:tblCellMar>
     </w:tblPr>
   </w:style>
   <w:style w:type="table" w:styleId="Sombreadoclaro">
@@ -21299,17 +20844,10 @@
     <w:tblPr>
       <w:tblStyleRowBandSize w:val="1"/>
       <w:tblStyleColBandSize w:val="1"/>
-      <w:tblInd w:w="0" w:type="dxa"/>
       <w:tblBorders>
         <w:top w:val="single" w:sz="8" w:space="0" w:color="000000" w:themeColor="text1"/>
         <w:bottom w:val="single" w:sz="8" w:space="0" w:color="000000" w:themeColor="text1"/>
       </w:tblBorders>
-      <w:tblCellMar>
-        <w:top w:w="0" w:type="dxa"/>
-        <w:left w:w="108" w:type="dxa"/>
-        <w:bottom w:w="0" w:type="dxa"/>
-        <w:right w:w="108" w:type="dxa"/>
-      </w:tblCellMar>
     </w:tblPr>
     <w:tblStylePr w:type="firstRow">
       <w:pPr>
@@ -21402,17 +20940,10 @@
     <w:tblPr>
       <w:tblStyleRowBandSize w:val="1"/>
       <w:tblStyleColBandSize w:val="1"/>
-      <w:tblInd w:w="0" w:type="dxa"/>
       <w:tblBorders>
         <w:top w:val="single" w:sz="8" w:space="0" w:color="4F81BD" w:themeColor="accent1"/>
         <w:bottom w:val="single" w:sz="8" w:space="0" w:color="4F81BD" w:themeColor="accent1"/>
       </w:tblBorders>
-      <w:tblCellMar>
-        <w:top w:w="0" w:type="dxa"/>
-        <w:left w:w="108" w:type="dxa"/>
-        <w:bottom w:w="0" w:type="dxa"/>
-        <w:right w:w="108" w:type="dxa"/>
-      </w:tblCellMar>
     </w:tblPr>
     <w:tblStylePr w:type="firstRow">
       <w:pPr>
@@ -21505,17 +21036,10 @@
     <w:tblPr>
       <w:tblStyleRowBandSize w:val="1"/>
       <w:tblStyleColBandSize w:val="1"/>
-      <w:tblInd w:w="0" w:type="dxa"/>
       <w:tblBorders>
         <w:top w:val="single" w:sz="8" w:space="0" w:color="C0504D" w:themeColor="accent2"/>
         <w:bottom w:val="single" w:sz="8" w:space="0" w:color="C0504D" w:themeColor="accent2"/>
       </w:tblBorders>
-      <w:tblCellMar>
-        <w:top w:w="0" w:type="dxa"/>
-        <w:left w:w="108" w:type="dxa"/>
-        <w:bottom w:w="0" w:type="dxa"/>
-        <w:right w:w="108" w:type="dxa"/>
-      </w:tblCellMar>
     </w:tblPr>
     <w:tblStylePr w:type="firstRow">
       <w:pPr>
@@ -21608,17 +21132,10 @@
     <w:tblPr>
       <w:tblStyleRowBandSize w:val="1"/>
       <w:tblStyleColBandSize w:val="1"/>
-      <w:tblInd w:w="0" w:type="dxa"/>
       <w:tblBorders>
         <w:top w:val="single" w:sz="8" w:space="0" w:color="9BBB59" w:themeColor="accent3"/>
         <w:bottom w:val="single" w:sz="8" w:space="0" w:color="9BBB59" w:themeColor="accent3"/>
       </w:tblBorders>
-      <w:tblCellMar>
-        <w:top w:w="0" w:type="dxa"/>
-        <w:left w:w="108" w:type="dxa"/>
-        <w:bottom w:w="0" w:type="dxa"/>
-        <w:right w:w="108" w:type="dxa"/>
-      </w:tblCellMar>
     </w:tblPr>
     <w:tblStylePr w:type="firstRow">
       <w:pPr>
@@ -21711,17 +21228,10 @@
     <w:tblPr>
       <w:tblStyleRowBandSize w:val="1"/>
       <w:tblStyleColBandSize w:val="1"/>
-      <w:tblInd w:w="0" w:type="dxa"/>
       <w:tblBorders>
         <w:top w:val="single" w:sz="8" w:space="0" w:color="8064A2" w:themeColor="accent4"/>
         <w:bottom w:val="single" w:sz="8" w:space="0" w:color="8064A2" w:themeColor="accent4"/>
       </w:tblBorders>
-      <w:tblCellMar>
-        <w:top w:w="0" w:type="dxa"/>
-        <w:left w:w="108" w:type="dxa"/>
-        <w:bottom w:w="0" w:type="dxa"/>
-        <w:right w:w="108" w:type="dxa"/>
-      </w:tblCellMar>
     </w:tblPr>
     <w:tblStylePr w:type="firstRow">
       <w:pPr>
@@ -21814,17 +21324,10 @@
     <w:tblPr>
       <w:tblStyleRowBandSize w:val="1"/>
       <w:tblStyleColBandSize w:val="1"/>
-      <w:tblInd w:w="0" w:type="dxa"/>
       <w:tblBorders>
         <w:top w:val="single" w:sz="8" w:space="0" w:color="4BACC6" w:themeColor="accent5"/>
         <w:bottom w:val="single" w:sz="8" w:space="0" w:color="4BACC6" w:themeColor="accent5"/>
       </w:tblBorders>
-      <w:tblCellMar>
-        <w:top w:w="0" w:type="dxa"/>
-        <w:left w:w="108" w:type="dxa"/>
-        <w:bottom w:w="0" w:type="dxa"/>
-        <w:right w:w="108" w:type="dxa"/>
-      </w:tblCellMar>
     </w:tblPr>
     <w:tblStylePr w:type="firstRow">
       <w:pPr>
@@ -21917,17 +21420,10 @@
     <w:tblPr>
       <w:tblStyleRowBandSize w:val="1"/>
       <w:tblStyleColBandSize w:val="1"/>
-      <w:tblInd w:w="0" w:type="dxa"/>
       <w:tblBorders>
         <w:top w:val="single" w:sz="8" w:space="0" w:color="F79646" w:themeColor="accent6"/>
         <w:bottom w:val="single" w:sz="8" w:space="0" w:color="F79646" w:themeColor="accent6"/>
       </w:tblBorders>
-      <w:tblCellMar>
-        <w:top w:w="0" w:type="dxa"/>
-        <w:left w:w="108" w:type="dxa"/>
-        <w:bottom w:w="0" w:type="dxa"/>
-        <w:right w:w="108" w:type="dxa"/>
-      </w:tblCellMar>
     </w:tblPr>
     <w:tblStylePr w:type="firstRow">
       <w:pPr>
@@ -22017,19 +21513,12 @@
     <w:tblPr>
       <w:tblStyleRowBandSize w:val="1"/>
       <w:tblStyleColBandSize w:val="1"/>
-      <w:tblInd w:w="0" w:type="dxa"/>
       <w:tblBorders>
         <w:top w:val="single" w:sz="8" w:space="0" w:color="000000" w:themeColor="text1"/>
         <w:left w:val="single" w:sz="8" w:space="0" w:color="000000" w:themeColor="text1"/>
         <w:bottom w:val="single" w:sz="8" w:space="0" w:color="000000" w:themeColor="text1"/>
         <w:right w:val="single" w:sz="8" w:space="0" w:color="000000" w:themeColor="text1"/>
       </w:tblBorders>
-      <w:tblCellMar>
-        <w:top w:w="0" w:type="dxa"/>
-        <w:left w:w="108" w:type="dxa"/>
-        <w:bottom w:w="0" w:type="dxa"/>
-        <w:right w:w="108" w:type="dxa"/>
-      </w:tblCellMar>
     </w:tblPr>
     <w:tblStylePr w:type="firstRow">
       <w:pPr>
@@ -22109,19 +21598,12 @@
     <w:tblPr>
       <w:tblStyleRowBandSize w:val="1"/>
       <w:tblStyleColBandSize w:val="1"/>
-      <w:tblInd w:w="0" w:type="dxa"/>
       <w:tblBorders>
         <w:top w:val="single" w:sz="8" w:space="0" w:color="4F81BD" w:themeColor="accent1"/>
         <w:left w:val="single" w:sz="8" w:space="0" w:color="4F81BD" w:themeColor="accent1"/>
         <w:bottom w:val="single" w:sz="8" w:space="0" w:color="4F81BD" w:themeColor="accent1"/>
         <w:right w:val="single" w:sz="8" w:space="0" w:color="4F81BD" w:themeColor="accent1"/>
       </w:tblBorders>
-      <w:tblCellMar>
-        <w:top w:w="0" w:type="dxa"/>
-        <w:left w:w="108" w:type="dxa"/>
-        <w:bottom w:w="0" w:type="dxa"/>
-        <w:right w:w="108" w:type="dxa"/>
-      </w:tblCellMar>
     </w:tblPr>
     <w:tblStylePr w:type="firstRow">
       <w:pPr>
@@ -22201,19 +21683,12 @@
     <w:tblPr>
       <w:tblStyleRowBandSize w:val="1"/>
       <w:tblStyleColBandSize w:val="1"/>
-      <w:tblInd w:w="0" w:type="dxa"/>
       <w:tblBorders>
         <w:top w:val="single" w:sz="8" w:space="0" w:color="C0504D" w:themeColor="accent2"/>
         <w:left w:val="single" w:sz="8" w:space="0" w:color="C0504D" w:themeColor="accent2"/>
         <w:bottom w:val="single" w:sz="8" w:space="0" w:color="C0504D" w:themeColor="accent2"/>
         <w:right w:val="single" w:sz="8" w:space="0" w:color="C0504D" w:themeColor="accent2"/>
       </w:tblBorders>
-      <w:tblCellMar>
-        <w:top w:w="0" w:type="dxa"/>
-        <w:left w:w="108" w:type="dxa"/>
-        <w:bottom w:w="0" w:type="dxa"/>
-        <w:right w:w="108" w:type="dxa"/>
-      </w:tblCellMar>
     </w:tblPr>
     <w:tblStylePr w:type="firstRow">
       <w:pPr>
@@ -22293,19 +21768,12 @@
     <w:tblPr>
       <w:tblStyleRowBandSize w:val="1"/>
       <w:tblStyleColBandSize w:val="1"/>
-      <w:tblInd w:w="0" w:type="dxa"/>
       <w:tblBorders>
         <w:top w:val="single" w:sz="8" w:space="0" w:color="9BBB59" w:themeColor="accent3"/>
         <w:left w:val="single" w:sz="8" w:space="0" w:color="9BBB59" w:themeColor="accent3"/>
         <w:bottom w:val="single" w:sz="8" w:space="0" w:color="9BBB59" w:themeColor="accent3"/>
         <w:right w:val="single" w:sz="8" w:space="0" w:color="9BBB59" w:themeColor="accent3"/>
       </w:tblBorders>
-      <w:tblCellMar>
-        <w:top w:w="0" w:type="dxa"/>
-        <w:left w:w="108" w:type="dxa"/>
-        <w:bottom w:w="0" w:type="dxa"/>
-        <w:right w:w="108" w:type="dxa"/>
-      </w:tblCellMar>
     </w:tblPr>
     <w:tblStylePr w:type="firstRow">
       <w:pPr>
@@ -22385,19 +21853,12 @@
     <w:tblPr>
       <w:tblStyleRowBandSize w:val="1"/>
       <w:tblStyleColBandSize w:val="1"/>
-      <w:tblInd w:w="0" w:type="dxa"/>
       <w:tblBorders>
         <w:top w:val="single" w:sz="8" w:space="0" w:color="8064A2" w:themeColor="accent4"/>
         <w:left w:val="single" w:sz="8" w:space="0" w:color="8064A2" w:themeColor="accent4"/>
         <w:bottom w:val="single" w:sz="8" w:space="0" w:color="8064A2" w:themeColor="accent4"/>
         <w:right w:val="single" w:sz="8" w:space="0" w:color="8064A2" w:themeColor="accent4"/>
       </w:tblBorders>
-      <w:tblCellMar>
-        <w:top w:w="0" w:type="dxa"/>
-        <w:left w:w="108" w:type="dxa"/>
-        <w:bottom w:w="0" w:type="dxa"/>
-        <w:right w:w="108" w:type="dxa"/>
-      </w:tblCellMar>
     </w:tblPr>
     <w:tblStylePr w:type="firstRow">
       <w:pPr>
@@ -22477,19 +21938,12 @@
     <w:tblPr>
       <w:tblStyleRowBandSize w:val="1"/>
       <w:tblStyleColBandSize w:val="1"/>
-      <w:tblInd w:w="0" w:type="dxa"/>
       <w:tblBorders>
         <w:top w:val="single" w:sz="8" w:space="0" w:color="4BACC6" w:themeColor="accent5"/>
         <w:left w:val="single" w:sz="8" w:space="0" w:color="4BACC6" w:themeColor="accent5"/>
         <w:bottom w:val="single" w:sz="8" w:space="0" w:color="4BACC6" w:themeColor="accent5"/>
         <w:right w:val="single" w:sz="8" w:space="0" w:color="4BACC6" w:themeColor="accent5"/>
       </w:tblBorders>
-      <w:tblCellMar>
-        <w:top w:w="0" w:type="dxa"/>
-        <w:left w:w="108" w:type="dxa"/>
-        <w:bottom w:w="0" w:type="dxa"/>
-        <w:right w:w="108" w:type="dxa"/>
-      </w:tblCellMar>
     </w:tblPr>
     <w:tblStylePr w:type="firstRow">
       <w:pPr>
@@ -22569,19 +22023,12 @@
     <w:tblPr>
       <w:tblStyleRowBandSize w:val="1"/>
       <w:tblStyleColBandSize w:val="1"/>
-      <w:tblInd w:w="0" w:type="dxa"/>
       <w:tblBorders>
         <w:top w:val="single" w:sz="8" w:space="0" w:color="F79646" w:themeColor="accent6"/>
         <w:left w:val="single" w:sz="8" w:space="0" w:color="F79646" w:themeColor="accent6"/>
         <w:bottom w:val="single" w:sz="8" w:space="0" w:color="F79646" w:themeColor="accent6"/>
         <w:right w:val="single" w:sz="8" w:space="0" w:color="F79646" w:themeColor="accent6"/>
       </w:tblBorders>
-      <w:tblCellMar>
-        <w:top w:w="0" w:type="dxa"/>
-        <w:left w:w="108" w:type="dxa"/>
-        <w:bottom w:w="0" w:type="dxa"/>
-        <w:right w:w="108" w:type="dxa"/>
-      </w:tblCellMar>
     </w:tblPr>
     <w:tblStylePr w:type="firstRow">
       <w:pPr>
@@ -22661,7 +22108,6 @@
     <w:tblPr>
       <w:tblStyleRowBandSize w:val="1"/>
       <w:tblStyleColBandSize w:val="1"/>
-      <w:tblInd w:w="0" w:type="dxa"/>
       <w:tblBorders>
         <w:top w:val="single" w:sz="8" w:space="0" w:color="000000" w:themeColor="text1"/>
         <w:left w:val="single" w:sz="8" w:space="0" w:color="000000" w:themeColor="text1"/>
@@ -22670,12 +22116,6 @@
         <w:insideH w:val="single" w:sz="8" w:space="0" w:color="000000" w:themeColor="text1"/>
         <w:insideV w:val="single" w:sz="8" w:space="0" w:color="000000" w:themeColor="text1"/>
       </w:tblBorders>
-      <w:tblCellMar>
-        <w:top w:w="0" w:type="dxa"/>
-        <w:left w:w="108" w:type="dxa"/>
-        <w:bottom w:w="0" w:type="dxa"/>
-        <w:right w:w="108" w:type="dxa"/>
-      </w:tblCellMar>
     </w:tblPr>
     <w:tblStylePr w:type="firstRow">
       <w:pPr>
@@ -22791,7 +22231,6 @@
     <w:tblPr>
       <w:tblStyleRowBandSize w:val="1"/>
       <w:tblStyleColBandSize w:val="1"/>
-      <w:tblInd w:w="0" w:type="dxa"/>
       <w:tblBorders>
         <w:top w:val="single" w:sz="8" w:space="0" w:color="4F81BD" w:themeColor="accent1"/>
         <w:left w:val="single" w:sz="8" w:space="0" w:color="4F81BD" w:themeColor="accent1"/>
@@ -22800,12 +22239,6 @@
         <w:insideH w:val="single" w:sz="8" w:space="0" w:color="4F81BD" w:themeColor="accent1"/>
         <w:insideV w:val="single" w:sz="8" w:space="0" w:color="4F81BD" w:themeColor="accent1"/>
       </w:tblBorders>
-      <w:tblCellMar>
-        <w:top w:w="0" w:type="dxa"/>
-        <w:left w:w="108" w:type="dxa"/>
-        <w:bottom w:w="0" w:type="dxa"/>
-        <w:right w:w="108" w:type="dxa"/>
-      </w:tblCellMar>
     </w:tblPr>
     <w:tblStylePr w:type="firstRow">
       <w:pPr>
@@ -22921,7 +22354,6 @@
     <w:tblPr>
       <w:tblStyleRowBandSize w:val="1"/>
       <w:tblStyleColBandSize w:val="1"/>
-      <w:tblInd w:w="0" w:type="dxa"/>
       <w:tblBorders>
         <w:top w:val="single" w:sz="8" w:space="0" w:color="C0504D" w:themeColor="accent2"/>
         <w:left w:val="single" w:sz="8" w:space="0" w:color="C0504D" w:themeColor="accent2"/>
@@ -22930,12 +22362,6 @@
         <w:insideH w:val="single" w:sz="8" w:space="0" w:color="C0504D" w:themeColor="accent2"/>
         <w:insideV w:val="single" w:sz="8" w:space="0" w:color="C0504D" w:themeColor="accent2"/>
       </w:tblBorders>
-      <w:tblCellMar>
-        <w:top w:w="0" w:type="dxa"/>
-        <w:left w:w="108" w:type="dxa"/>
-        <w:bottom w:w="0" w:type="dxa"/>
-        <w:right w:w="108" w:type="dxa"/>
-      </w:tblCellMar>
     </w:tblPr>
     <w:tblStylePr w:type="firstRow">
       <w:pPr>
@@ -23051,7 +22477,6 @@
     <w:tblPr>
       <w:tblStyleRowBandSize w:val="1"/>
       <w:tblStyleColBandSize w:val="1"/>
-      <w:tblInd w:w="0" w:type="dxa"/>
       <w:tblBorders>
         <w:top w:val="single" w:sz="8" w:space="0" w:color="9BBB59" w:themeColor="accent3"/>
         <w:left w:val="single" w:sz="8" w:space="0" w:color="9BBB59" w:themeColor="accent3"/>
@@ -23060,12 +22485,6 @@
         <w:insideH w:val="single" w:sz="8" w:space="0" w:color="9BBB59" w:themeColor="accent3"/>
         <w:insideV w:val="single" w:sz="8" w:space="0" w:color="9BBB59" w:themeColor="accent3"/>
       </w:tblBorders>
-      <w:tblCellMar>
-        <w:top w:w="0" w:type="dxa"/>
-        <w:left w:w="108" w:type="dxa"/>
-        <w:bottom w:w="0" w:type="dxa"/>
-        <w:right w:w="108" w:type="dxa"/>
-      </w:tblCellMar>
     </w:tblPr>
     <w:tblStylePr w:type="firstRow">
       <w:pPr>
@@ -23181,7 +22600,6 @@
     <w:tblPr>
       <w:tblStyleRowBandSize w:val="1"/>
       <w:tblStyleColBandSize w:val="1"/>
-      <w:tblInd w:w="0" w:type="dxa"/>
       <w:tblBorders>
         <w:top w:val="single" w:sz="8" w:space="0" w:color="8064A2" w:themeColor="accent4"/>
         <w:left w:val="single" w:sz="8" w:space="0" w:color="8064A2" w:themeColor="accent4"/>
@@ -23190,12 +22608,6 @@
         <w:insideH w:val="single" w:sz="8" w:space="0" w:color="8064A2" w:themeColor="accent4"/>
         <w:insideV w:val="single" w:sz="8" w:space="0" w:color="8064A2" w:themeColor="accent4"/>
       </w:tblBorders>
-      <w:tblCellMar>
-        <w:top w:w="0" w:type="dxa"/>
-        <w:left w:w="108" w:type="dxa"/>
-        <w:bottom w:w="0" w:type="dxa"/>
-        <w:right w:w="108" w:type="dxa"/>
-      </w:tblCellMar>
     </w:tblPr>
     <w:tblStylePr w:type="firstRow">
       <w:pPr>
@@ -23311,7 +22723,6 @@
     <w:tblPr>
       <w:tblStyleRowBandSize w:val="1"/>
       <w:tblStyleColBandSize w:val="1"/>
-      <w:tblInd w:w="0" w:type="dxa"/>
       <w:tblBorders>
         <w:top w:val="single" w:sz="8" w:space="0" w:color="4BACC6" w:themeColor="accent5"/>
         <w:left w:val="single" w:sz="8" w:space="0" w:color="4BACC6" w:themeColor="accent5"/>
@@ -23320,12 +22731,6 @@
         <w:insideH w:val="single" w:sz="8" w:space="0" w:color="4BACC6" w:themeColor="accent5"/>
         <w:insideV w:val="single" w:sz="8" w:space="0" w:color="4BACC6" w:themeColor="accent5"/>
       </w:tblBorders>
-      <w:tblCellMar>
-        <w:top w:w="0" w:type="dxa"/>
-        <w:left w:w="108" w:type="dxa"/>
-        <w:bottom w:w="0" w:type="dxa"/>
-        <w:right w:w="108" w:type="dxa"/>
-      </w:tblCellMar>
     </w:tblPr>
     <w:tblStylePr w:type="firstRow">
       <w:pPr>
@@ -23441,7 +22846,6 @@
     <w:tblPr>
       <w:tblStyleRowBandSize w:val="1"/>
       <w:tblStyleColBandSize w:val="1"/>
-      <w:tblInd w:w="0" w:type="dxa"/>
       <w:tblBorders>
         <w:top w:val="single" w:sz="8" w:space="0" w:color="F79646" w:themeColor="accent6"/>
         <w:left w:val="single" w:sz="8" w:space="0" w:color="F79646" w:themeColor="accent6"/>
@@ -23450,12 +22854,6 @@
         <w:insideH w:val="single" w:sz="8" w:space="0" w:color="F79646" w:themeColor="accent6"/>
         <w:insideV w:val="single" w:sz="8" w:space="0" w:color="F79646" w:themeColor="accent6"/>
       </w:tblBorders>
-      <w:tblCellMar>
-        <w:top w:w="0" w:type="dxa"/>
-        <w:left w:w="108" w:type="dxa"/>
-        <w:bottom w:w="0" w:type="dxa"/>
-        <w:right w:w="108" w:type="dxa"/>
-      </w:tblCellMar>
     </w:tblPr>
     <w:tblStylePr w:type="firstRow">
       <w:pPr>
@@ -23571,7 +22969,6 @@
     <w:tblPr>
       <w:tblStyleRowBandSize w:val="1"/>
       <w:tblStyleColBandSize w:val="1"/>
-      <w:tblInd w:w="0" w:type="dxa"/>
       <w:tblBorders>
         <w:top w:val="single" w:sz="8" w:space="0" w:color="404040" w:themeColor="text1" w:themeTint="BF"/>
         <w:left w:val="single" w:sz="8" w:space="0" w:color="404040" w:themeColor="text1" w:themeTint="BF"/>
@@ -23579,12 +22976,6 @@
         <w:right w:val="single" w:sz="8" w:space="0" w:color="404040" w:themeColor="text1" w:themeTint="BF"/>
         <w:insideH w:val="single" w:sz="8" w:space="0" w:color="404040" w:themeColor="text1" w:themeTint="BF"/>
       </w:tblBorders>
-      <w:tblCellMar>
-        <w:top w:w="0" w:type="dxa"/>
-        <w:left w:w="108" w:type="dxa"/>
-        <w:bottom w:w="0" w:type="dxa"/>
-        <w:right w:w="108" w:type="dxa"/>
-      </w:tblCellMar>
     </w:tblPr>
     <w:tblStylePr w:type="firstRow">
       <w:pPr>
@@ -23677,7 +23068,6 @@
     <w:tblPr>
       <w:tblStyleRowBandSize w:val="1"/>
       <w:tblStyleColBandSize w:val="1"/>
-      <w:tblInd w:w="0" w:type="dxa"/>
       <w:tblBorders>
         <w:top w:val="single" w:sz="8" w:space="0" w:color="7BA0CD" w:themeColor="accent1" w:themeTint="BF"/>
         <w:left w:val="single" w:sz="8" w:space="0" w:color="7BA0CD" w:themeColor="accent1" w:themeTint="BF"/>
@@ -23685,12 +23075,6 @@
         <w:right w:val="single" w:sz="8" w:space="0" w:color="7BA0CD" w:themeColor="accent1" w:themeTint="BF"/>
         <w:insideH w:val="single" w:sz="8" w:space="0" w:color="7BA0CD" w:themeColor="accent1" w:themeTint="BF"/>
       </w:tblBorders>
-      <w:tblCellMar>
-        <w:top w:w="0" w:type="dxa"/>
-        <w:left w:w="108" w:type="dxa"/>
-        <w:bottom w:w="0" w:type="dxa"/>
-        <w:right w:w="108" w:type="dxa"/>
-      </w:tblCellMar>
     </w:tblPr>
     <w:tblStylePr w:type="firstRow">
       <w:pPr>
@@ -23783,7 +23167,6 @@
     <w:tblPr>
       <w:tblStyleRowBandSize w:val="1"/>
       <w:tblStyleColBandSize w:val="1"/>
-      <w:tblInd w:w="0" w:type="dxa"/>
       <w:tblBorders>
         <w:top w:val="single" w:sz="8" w:space="0" w:color="CF7B79" w:themeColor="accent2" w:themeTint="BF"/>
         <w:left w:val="single" w:sz="8" w:space="0" w:color="CF7B79" w:themeColor="accent2" w:themeTint="BF"/>
@@ -23791,12 +23174,6 @@
         <w:right w:val="single" w:sz="8" w:space="0" w:color="CF7B79" w:themeColor="accent2" w:themeTint="BF"/>
         <w:insideH w:val="single" w:sz="8" w:space="0" w:color="CF7B79" w:themeColor="accent2" w:themeTint="BF"/>
       </w:tblBorders>
-      <w:tblCellMar>
-        <w:top w:w="0" w:type="dxa"/>
-        <w:left w:w="108" w:type="dxa"/>
-        <w:bottom w:w="0" w:type="dxa"/>
-        <w:right w:w="108" w:type="dxa"/>
-      </w:tblCellMar>
     </w:tblPr>
     <w:tblStylePr w:type="firstRow">
       <w:pPr>
@@ -23889,7 +23266,6 @@
     <w:tblPr>
       <w:tblStyleRowBandSize w:val="1"/>
       <w:tblStyleColBandSize w:val="1"/>
-      <w:tblInd w:w="0" w:type="dxa"/>
       <w:tblBorders>
         <w:top w:val="single" w:sz="8" w:space="0" w:color="B3CC82" w:themeColor="accent3" w:themeTint="BF"/>
         <w:left w:val="single" w:sz="8" w:space="0" w:color="B3CC82" w:themeColor="accent3" w:themeTint="BF"/>
@@ -23897,12 +23273,6 @@
         <w:right w:val="single" w:sz="8" w:space="0" w:color="B3CC82" w:themeColor="accent3" w:themeTint="BF"/>
         <w:insideH w:val="single" w:sz="8" w:space="0" w:color="B3CC82" w:themeColor="accent3" w:themeTint="BF"/>
       </w:tblBorders>
-      <w:tblCellMar>
-        <w:top w:w="0" w:type="dxa"/>
-        <w:left w:w="108" w:type="dxa"/>
-        <w:bottom w:w="0" w:type="dxa"/>
-        <w:right w:w="108" w:type="dxa"/>
-      </w:tblCellMar>
     </w:tblPr>
     <w:tblStylePr w:type="firstRow">
       <w:pPr>
@@ -23995,7 +23365,6 @@
     <w:tblPr>
       <w:tblStyleRowBandSize w:val="1"/>
       <w:tblStyleColBandSize w:val="1"/>
-      <w:tblInd w:w="0" w:type="dxa"/>
       <w:tblBorders>
         <w:top w:val="single" w:sz="8" w:space="0" w:color="9F8AB9" w:themeColor="accent4" w:themeTint="BF"/>
         <w:left w:val="single" w:sz="8" w:space="0" w:color="9F8AB9" w:themeColor="accent4" w:themeTint="BF"/>
@@ -24003,12 +23372,6 @@
         <w:right w:val="single" w:sz="8" w:space="0" w:color="9F8AB9" w:themeColor="accent4" w:themeTint="BF"/>
         <w:insideH w:val="single" w:sz="8" w:space="0" w:color="9F8AB9" w:themeColor="accent4" w:themeTint="BF"/>
       </w:tblBorders>
-      <w:tblCellMar>
-        <w:top w:w="0" w:type="dxa"/>
-        <w:left w:w="108" w:type="dxa"/>
-        <w:bottom w:w="0" w:type="dxa"/>
-        <w:right w:w="108" w:type="dxa"/>
-      </w:tblCellMar>
     </w:tblPr>
     <w:tblStylePr w:type="firstRow">
       <w:pPr>
@@ -24101,7 +23464,6 @@
     <w:tblPr>
       <w:tblStyleRowBandSize w:val="1"/>
       <w:tblStyleColBandSize w:val="1"/>
-      <w:tblInd w:w="0" w:type="dxa"/>
       <w:tblBorders>
         <w:top w:val="single" w:sz="8" w:space="0" w:color="78C0D4" w:themeColor="accent5" w:themeTint="BF"/>
         <w:left w:val="single" w:sz="8" w:space="0" w:color="78C0D4" w:themeColor="accent5" w:themeTint="BF"/>
@@ -24109,12 +23471,6 @@
         <w:right w:val="single" w:sz="8" w:space="0" w:color="78C0D4" w:themeColor="accent5" w:themeTint="BF"/>
         <w:insideH w:val="single" w:sz="8" w:space="0" w:color="78C0D4" w:themeColor="accent5" w:themeTint="BF"/>
       </w:tblBorders>
-      <w:tblCellMar>
-        <w:top w:w="0" w:type="dxa"/>
-        <w:left w:w="108" w:type="dxa"/>
-        <w:bottom w:w="0" w:type="dxa"/>
-        <w:right w:w="108" w:type="dxa"/>
-      </w:tblCellMar>
     </w:tblPr>
     <w:tblStylePr w:type="firstRow">
       <w:pPr>
@@ -24207,7 +23563,6 @@
     <w:tblPr>
       <w:tblStyleRowBandSize w:val="1"/>
       <w:tblStyleColBandSize w:val="1"/>
-      <w:tblInd w:w="0" w:type="dxa"/>
       <w:tblBorders>
         <w:top w:val="single" w:sz="8" w:space="0" w:color="F9B074" w:themeColor="accent6" w:themeTint="BF"/>
         <w:left w:val="single" w:sz="8" w:space="0" w:color="F9B074" w:themeColor="accent6" w:themeTint="BF"/>
@@ -24215,12 +23570,6 @@
         <w:right w:val="single" w:sz="8" w:space="0" w:color="F9B074" w:themeColor="accent6" w:themeTint="BF"/>
         <w:insideH w:val="single" w:sz="8" w:space="0" w:color="F9B074" w:themeColor="accent6" w:themeTint="BF"/>
       </w:tblBorders>
-      <w:tblCellMar>
-        <w:top w:w="0" w:type="dxa"/>
-        <w:left w:w="108" w:type="dxa"/>
-        <w:bottom w:w="0" w:type="dxa"/>
-        <w:right w:w="108" w:type="dxa"/>
-      </w:tblCellMar>
     </w:tblPr>
     <w:tblStylePr w:type="firstRow">
       <w:pPr>
@@ -24313,17 +23662,10 @@
     <w:tblPr>
       <w:tblStyleRowBandSize w:val="1"/>
       <w:tblStyleColBandSize w:val="1"/>
-      <w:tblInd w:w="0" w:type="dxa"/>
       <w:tblBorders>
         <w:top w:val="single" w:sz="18" w:space="0" w:color="auto"/>
         <w:bottom w:val="single" w:sz="18" w:space="0" w:color="auto"/>
       </w:tblBorders>
-      <w:tblCellMar>
-        <w:top w:w="0" w:type="dxa"/>
-        <w:left w:w="108" w:type="dxa"/>
-        <w:bottom w:w="0" w:type="dxa"/>
-        <w:right w:w="108" w:type="dxa"/>
-      </w:tblCellMar>
     </w:tblPr>
     <w:tblStylePr w:type="firstRow">
       <w:pPr>
@@ -24462,17 +23804,10 @@
     <w:tblPr>
       <w:tblStyleRowBandSize w:val="1"/>
       <w:tblStyleColBandSize w:val="1"/>
-      <w:tblInd w:w="0" w:type="dxa"/>
       <w:tblBorders>
         <w:top w:val="single" w:sz="18" w:space="0" w:color="auto"/>
         <w:bottom w:val="single" w:sz="18" w:space="0" w:color="auto"/>
       </w:tblBorders>
-      <w:tblCellMar>
-        <w:top w:w="0" w:type="dxa"/>
-        <w:left w:w="108" w:type="dxa"/>
-        <w:bottom w:w="0" w:type="dxa"/>
-        <w:right w:w="108" w:type="dxa"/>
-      </w:tblCellMar>
     </w:tblPr>
     <w:tblStylePr w:type="firstRow">
       <w:pPr>
@@ -24611,17 +23946,10 @@
     <w:tblPr>
       <w:tblStyleRowBandSize w:val="1"/>
       <w:tblStyleColBandSize w:val="1"/>
-      <w:tblInd w:w="0" w:type="dxa"/>
       <w:tblBorders>
         <w:top w:val="single" w:sz="18" w:space="0" w:color="auto"/>
         <w:bottom w:val="single" w:sz="18" w:space="0" w:color="auto"/>
       </w:tblBorders>
-      <w:tblCellMar>
-        <w:top w:w="0" w:type="dxa"/>
-        <w:left w:w="108" w:type="dxa"/>
-        <w:bottom w:w="0" w:type="dxa"/>
-        <w:right w:w="108" w:type="dxa"/>
-      </w:tblCellMar>
     </w:tblPr>
     <w:tblStylePr w:type="firstRow">
       <w:pPr>
@@ -24760,17 +24088,10 @@
     <w:tblPr>
       <w:tblStyleRowBandSize w:val="1"/>
       <w:tblStyleColBandSize w:val="1"/>
-      <w:tblInd w:w="0" w:type="dxa"/>
       <w:tblBorders>
         <w:top w:val="single" w:sz="18" w:space="0" w:color="auto"/>
         <w:bottom w:val="single" w:sz="18" w:space="0" w:color="auto"/>
       </w:tblBorders>
-      <w:tblCellMar>
-        <w:top w:w="0" w:type="dxa"/>
-        <w:left w:w="108" w:type="dxa"/>
-        <w:bottom w:w="0" w:type="dxa"/>
-        <w:right w:w="108" w:type="dxa"/>
-      </w:tblCellMar>
     </w:tblPr>
     <w:tblStylePr w:type="firstRow">
       <w:pPr>
@@ -24909,17 +24230,10 @@
     <w:tblPr>
       <w:tblStyleRowBandSize w:val="1"/>
       <w:tblStyleColBandSize w:val="1"/>
-      <w:tblInd w:w="0" w:type="dxa"/>
       <w:tblBorders>
         <w:top w:val="single" w:sz="18" w:space="0" w:color="auto"/>
         <w:bottom w:val="single" w:sz="18" w:space="0" w:color="auto"/>
       </w:tblBorders>
-      <w:tblCellMar>
-        <w:top w:w="0" w:type="dxa"/>
-        <w:left w:w="108" w:type="dxa"/>
-        <w:bottom w:w="0" w:type="dxa"/>
-        <w:right w:w="108" w:type="dxa"/>
-      </w:tblCellMar>
     </w:tblPr>
     <w:tblStylePr w:type="firstRow">
       <w:pPr>
@@ -25058,17 +24372,10 @@
     <w:tblPr>
       <w:tblStyleRowBandSize w:val="1"/>
       <w:tblStyleColBandSize w:val="1"/>
-      <w:tblInd w:w="0" w:type="dxa"/>
       <w:tblBorders>
         <w:top w:val="single" w:sz="18" w:space="0" w:color="auto"/>
         <w:bottom w:val="single" w:sz="18" w:space="0" w:color="auto"/>
       </w:tblBorders>
-      <w:tblCellMar>
-        <w:top w:w="0" w:type="dxa"/>
-        <w:left w:w="108" w:type="dxa"/>
-        <w:bottom w:w="0" w:type="dxa"/>
-        <w:right w:w="108" w:type="dxa"/>
-      </w:tblCellMar>
     </w:tblPr>
     <w:tblStylePr w:type="firstRow">
       <w:pPr>
@@ -25207,17 +24514,10 @@
     <w:tblPr>
       <w:tblStyleRowBandSize w:val="1"/>
       <w:tblStyleColBandSize w:val="1"/>
-      <w:tblInd w:w="0" w:type="dxa"/>
       <w:tblBorders>
         <w:top w:val="single" w:sz="18" w:space="0" w:color="auto"/>
         <w:bottom w:val="single" w:sz="18" w:space="0" w:color="auto"/>
       </w:tblBorders>
-      <w:tblCellMar>
-        <w:top w:w="0" w:type="dxa"/>
-        <w:left w:w="108" w:type="dxa"/>
-        <w:bottom w:w="0" w:type="dxa"/>
-        <w:right w:w="108" w:type="dxa"/>
-      </w:tblCellMar>
     </w:tblPr>
     <w:tblStylePr w:type="firstRow">
       <w:pPr>
@@ -25359,17 +24659,10 @@
     <w:tblPr>
       <w:tblStyleRowBandSize w:val="1"/>
       <w:tblStyleColBandSize w:val="1"/>
-      <w:tblInd w:w="0" w:type="dxa"/>
       <w:tblBorders>
         <w:top w:val="single" w:sz="8" w:space="0" w:color="000000" w:themeColor="text1"/>
         <w:bottom w:val="single" w:sz="8" w:space="0" w:color="000000" w:themeColor="text1"/>
       </w:tblBorders>
-      <w:tblCellMar>
-        <w:top w:w="0" w:type="dxa"/>
-        <w:left w:w="108" w:type="dxa"/>
-        <w:bottom w:w="0" w:type="dxa"/>
-        <w:right w:w="108" w:type="dxa"/>
-      </w:tblCellMar>
     </w:tblPr>
     <w:tblStylePr w:type="firstRow">
       <w:rPr>
@@ -25443,17 +24736,10 @@
     <w:tblPr>
       <w:tblStyleRowBandSize w:val="1"/>
       <w:tblStyleColBandSize w:val="1"/>
-      <w:tblInd w:w="0" w:type="dxa"/>
       <w:tblBorders>
         <w:top w:val="single" w:sz="8" w:space="0" w:color="4F81BD" w:themeColor="accent1"/>
         <w:bottom w:val="single" w:sz="8" w:space="0" w:color="4F81BD" w:themeColor="accent1"/>
       </w:tblBorders>
-      <w:tblCellMar>
-        <w:top w:w="0" w:type="dxa"/>
-        <w:left w:w="108" w:type="dxa"/>
-        <w:bottom w:w="0" w:type="dxa"/>
-        <w:right w:w="108" w:type="dxa"/>
-      </w:tblCellMar>
     </w:tblPr>
     <w:tblStylePr w:type="firstRow">
       <w:rPr>
@@ -25527,17 +24813,10 @@
     <w:tblPr>
       <w:tblStyleRowBandSize w:val="1"/>
       <w:tblStyleColBandSize w:val="1"/>
-      <w:tblInd w:w="0" w:type="dxa"/>
       <w:tblBorders>
         <w:top w:val="single" w:sz="8" w:space="0" w:color="C0504D" w:themeColor="accent2"/>
         <w:bottom w:val="single" w:sz="8" w:space="0" w:color="C0504D" w:themeColor="accent2"/>
       </w:tblBorders>
-      <w:tblCellMar>
-        <w:top w:w="0" w:type="dxa"/>
-        <w:left w:w="108" w:type="dxa"/>
-        <w:bottom w:w="0" w:type="dxa"/>
-        <w:right w:w="108" w:type="dxa"/>
-      </w:tblCellMar>
     </w:tblPr>
     <w:tblStylePr w:type="firstRow">
       <w:rPr>
@@ -25611,17 +24890,10 @@
     <w:tblPr>
       <w:tblStyleRowBandSize w:val="1"/>
       <w:tblStyleColBandSize w:val="1"/>
-      <w:tblInd w:w="0" w:type="dxa"/>
       <w:tblBorders>
         <w:top w:val="single" w:sz="8" w:space="0" w:color="9BBB59" w:themeColor="accent3"/>
         <w:bottom w:val="single" w:sz="8" w:space="0" w:color="9BBB59" w:themeColor="accent3"/>
       </w:tblBorders>
-      <w:tblCellMar>
-        <w:top w:w="0" w:type="dxa"/>
-        <w:left w:w="108" w:type="dxa"/>
-        <w:bottom w:w="0" w:type="dxa"/>
-        <w:right w:w="108" w:type="dxa"/>
-      </w:tblCellMar>
     </w:tblPr>
     <w:tblStylePr w:type="firstRow">
       <w:rPr>
@@ -25695,17 +24967,10 @@
     <w:tblPr>
       <w:tblStyleRowBandSize w:val="1"/>
       <w:tblStyleColBandSize w:val="1"/>
-      <w:tblInd w:w="0" w:type="dxa"/>
       <w:tblBorders>
         <w:top w:val="single" w:sz="8" w:space="0" w:color="8064A2" w:themeColor="accent4"/>
         <w:bottom w:val="single" w:sz="8" w:space="0" w:color="8064A2" w:themeColor="accent4"/>
       </w:tblBorders>
-      <w:tblCellMar>
-        <w:top w:w="0" w:type="dxa"/>
-        <w:left w:w="108" w:type="dxa"/>
-        <w:bottom w:w="0" w:type="dxa"/>
-        <w:right w:w="108" w:type="dxa"/>
-      </w:tblCellMar>
     </w:tblPr>
     <w:tblStylePr w:type="firstRow">
       <w:rPr>
@@ -25779,17 +25044,10 @@
     <w:tblPr>
       <w:tblStyleRowBandSize w:val="1"/>
       <w:tblStyleColBandSize w:val="1"/>
-      <w:tblInd w:w="0" w:type="dxa"/>
       <w:tblBorders>
         <w:top w:val="single" w:sz="8" w:space="0" w:color="4BACC6" w:themeColor="accent5"/>
         <w:bottom w:val="single" w:sz="8" w:space="0" w:color="4BACC6" w:themeColor="accent5"/>
       </w:tblBorders>
-      <w:tblCellMar>
-        <w:top w:w="0" w:type="dxa"/>
-        <w:left w:w="108" w:type="dxa"/>
-        <w:bottom w:w="0" w:type="dxa"/>
-        <w:right w:w="108" w:type="dxa"/>
-      </w:tblCellMar>
     </w:tblPr>
     <w:tblStylePr w:type="firstRow">
       <w:rPr>
@@ -25863,17 +25121,10 @@
     <w:tblPr>
       <w:tblStyleRowBandSize w:val="1"/>
       <w:tblStyleColBandSize w:val="1"/>
-      <w:tblInd w:w="0" w:type="dxa"/>
       <w:tblBorders>
         <w:top w:val="single" w:sz="8" w:space="0" w:color="F79646" w:themeColor="accent6"/>
         <w:bottom w:val="single" w:sz="8" w:space="0" w:color="F79646" w:themeColor="accent6"/>
       </w:tblBorders>
-      <w:tblCellMar>
-        <w:top w:w="0" w:type="dxa"/>
-        <w:left w:w="108" w:type="dxa"/>
-        <w:bottom w:w="0" w:type="dxa"/>
-        <w:right w:w="108" w:type="dxa"/>
-      </w:tblCellMar>
     </w:tblPr>
     <w:tblStylePr w:type="firstRow">
       <w:rPr>
@@ -25948,19 +25199,12 @@
     <w:tblPr>
       <w:tblStyleRowBandSize w:val="1"/>
       <w:tblStyleColBandSize w:val="1"/>
-      <w:tblInd w:w="0" w:type="dxa"/>
       <w:tblBorders>
         <w:top w:val="single" w:sz="8" w:space="0" w:color="000000" w:themeColor="text1"/>
         <w:left w:val="single" w:sz="8" w:space="0" w:color="000000" w:themeColor="text1"/>
         <w:bottom w:val="single" w:sz="8" w:space="0" w:color="000000" w:themeColor="text1"/>
         <w:right w:val="single" w:sz="8" w:space="0" w:color="000000" w:themeColor="text1"/>
       </w:tblBorders>
-      <w:tblCellMar>
-        <w:top w:w="0" w:type="dxa"/>
-        <w:left w:w="108" w:type="dxa"/>
-        <w:bottom w:w="0" w:type="dxa"/>
-        <w:right w:w="108" w:type="dxa"/>
-      </w:tblCellMar>
     </w:tblPr>
     <w:tblStylePr w:type="firstRow">
       <w:rPr>
@@ -26076,19 +25320,12 @@
     <w:tblPr>
       <w:tblStyleRowBandSize w:val="1"/>
       <w:tblStyleColBandSize w:val="1"/>
-      <w:tblInd w:w="0" w:type="dxa"/>
       <w:tblBorders>
         <w:top w:val="single" w:sz="8" w:space="0" w:color="4F81BD" w:themeColor="accent1"/>
         <w:left w:val="single" w:sz="8" w:space="0" w:color="4F81BD" w:themeColor="accent1"/>
         <w:bottom w:val="single" w:sz="8" w:space="0" w:color="4F81BD" w:themeColor="accent1"/>
         <w:right w:val="single" w:sz="8" w:space="0" w:color="4F81BD" w:themeColor="accent1"/>
       </w:tblBorders>
-      <w:tblCellMar>
-        <w:top w:w="0" w:type="dxa"/>
-        <w:left w:w="108" w:type="dxa"/>
-        <w:bottom w:w="0" w:type="dxa"/>
-        <w:right w:w="108" w:type="dxa"/>
-      </w:tblCellMar>
     </w:tblPr>
     <w:tblStylePr w:type="firstRow">
       <w:rPr>
@@ -26204,19 +25441,12 @@
     <w:tblPr>
       <w:tblStyleRowBandSize w:val="1"/>
       <w:tblStyleColBandSize w:val="1"/>
-      <w:tblInd w:w="0" w:type="dxa"/>
       <w:tblBorders>
         <w:top w:val="single" w:sz="8" w:space="0" w:color="C0504D" w:themeColor="accent2"/>
         <w:left w:val="single" w:sz="8" w:space="0" w:color="C0504D" w:themeColor="accent2"/>
         <w:bottom w:val="single" w:sz="8" w:space="0" w:color="C0504D" w:themeColor="accent2"/>
         <w:right w:val="single" w:sz="8" w:space="0" w:color="C0504D" w:themeColor="accent2"/>
       </w:tblBorders>
-      <w:tblCellMar>
-        <w:top w:w="0" w:type="dxa"/>
-        <w:left w:w="108" w:type="dxa"/>
-        <w:bottom w:w="0" w:type="dxa"/>
-        <w:right w:w="108" w:type="dxa"/>
-      </w:tblCellMar>
     </w:tblPr>
     <w:tblStylePr w:type="firstRow">
       <w:rPr>
@@ -26332,19 +25562,12 @@
     <w:tblPr>
       <w:tblStyleRowBandSize w:val="1"/>
       <w:tblStyleColBandSize w:val="1"/>
-      <w:tblInd w:w="0" w:type="dxa"/>
       <w:tblBorders>
         <w:top w:val="single" w:sz="8" w:space="0" w:color="9BBB59" w:themeColor="accent3"/>
         <w:left w:val="single" w:sz="8" w:space="0" w:color="9BBB59" w:themeColor="accent3"/>
         <w:bottom w:val="single" w:sz="8" w:space="0" w:color="9BBB59" w:themeColor="accent3"/>
         <w:right w:val="single" w:sz="8" w:space="0" w:color="9BBB59" w:themeColor="accent3"/>
       </w:tblBorders>
-      <w:tblCellMar>
-        <w:top w:w="0" w:type="dxa"/>
-        <w:left w:w="108" w:type="dxa"/>
-        <w:bottom w:w="0" w:type="dxa"/>
-        <w:right w:w="108" w:type="dxa"/>
-      </w:tblCellMar>
     </w:tblPr>
     <w:tblStylePr w:type="firstRow">
       <w:rPr>
@@ -26460,19 +25683,12 @@
     <w:tblPr>
       <w:tblStyleRowBandSize w:val="1"/>
       <w:tblStyleColBandSize w:val="1"/>
-      <w:tblInd w:w="0" w:type="dxa"/>
       <w:tblBorders>
         <w:top w:val="single" w:sz="8" w:space="0" w:color="8064A2" w:themeColor="accent4"/>
         <w:left w:val="single" w:sz="8" w:space="0" w:color="8064A2" w:themeColor="accent4"/>
         <w:bottom w:val="single" w:sz="8" w:space="0" w:color="8064A2" w:themeColor="accent4"/>
         <w:right w:val="single" w:sz="8" w:space="0" w:color="8064A2" w:themeColor="accent4"/>
       </w:tblBorders>
-      <w:tblCellMar>
-        <w:top w:w="0" w:type="dxa"/>
-        <w:left w:w="108" w:type="dxa"/>
-        <w:bottom w:w="0" w:type="dxa"/>
-        <w:right w:w="108" w:type="dxa"/>
-      </w:tblCellMar>
     </w:tblPr>
     <w:tblStylePr w:type="firstRow">
       <w:rPr>
@@ -26588,19 +25804,12 @@
     <w:tblPr>
       <w:tblStyleRowBandSize w:val="1"/>
       <w:tblStyleColBandSize w:val="1"/>
-      <w:tblInd w:w="0" w:type="dxa"/>
       <w:tblBorders>
         <w:top w:val="single" w:sz="8" w:space="0" w:color="4BACC6" w:themeColor="accent5"/>
         <w:left w:val="single" w:sz="8" w:space="0" w:color="4BACC6" w:themeColor="accent5"/>
         <w:bottom w:val="single" w:sz="8" w:space="0" w:color="4BACC6" w:themeColor="accent5"/>
         <w:right w:val="single" w:sz="8" w:space="0" w:color="4BACC6" w:themeColor="accent5"/>
       </w:tblBorders>
-      <w:tblCellMar>
-        <w:top w:w="0" w:type="dxa"/>
-        <w:left w:w="108" w:type="dxa"/>
-        <w:bottom w:w="0" w:type="dxa"/>
-        <w:right w:w="108" w:type="dxa"/>
-      </w:tblCellMar>
     </w:tblPr>
     <w:tblStylePr w:type="firstRow">
       <w:rPr>
@@ -26716,19 +25925,12 @@
     <w:tblPr>
       <w:tblStyleRowBandSize w:val="1"/>
       <w:tblStyleColBandSize w:val="1"/>
-      <w:tblInd w:w="0" w:type="dxa"/>
       <w:tblBorders>
         <w:top w:val="single" w:sz="8" w:space="0" w:color="F79646" w:themeColor="accent6"/>
         <w:left w:val="single" w:sz="8" w:space="0" w:color="F79646" w:themeColor="accent6"/>
         <w:bottom w:val="single" w:sz="8" w:space="0" w:color="F79646" w:themeColor="accent6"/>
         <w:right w:val="single" w:sz="8" w:space="0" w:color="F79646" w:themeColor="accent6"/>
       </w:tblBorders>
-      <w:tblCellMar>
-        <w:top w:w="0" w:type="dxa"/>
-        <w:left w:w="108" w:type="dxa"/>
-        <w:bottom w:w="0" w:type="dxa"/>
-        <w:right w:w="108" w:type="dxa"/>
-      </w:tblCellMar>
     </w:tblPr>
     <w:tblStylePr w:type="firstRow">
       <w:rPr>
@@ -26840,7 +26042,6 @@
     <w:tblPr>
       <w:tblStyleRowBandSize w:val="1"/>
       <w:tblStyleColBandSize w:val="1"/>
-      <w:tblInd w:w="0" w:type="dxa"/>
       <w:tblBorders>
         <w:top w:val="single" w:sz="8" w:space="0" w:color="404040" w:themeColor="text1" w:themeTint="BF"/>
         <w:left w:val="single" w:sz="8" w:space="0" w:color="404040" w:themeColor="text1" w:themeTint="BF"/>
@@ -26849,12 +26050,6 @@
         <w:insideH w:val="single" w:sz="8" w:space="0" w:color="404040" w:themeColor="text1" w:themeTint="BF"/>
         <w:insideV w:val="single" w:sz="8" w:space="0" w:color="404040" w:themeColor="text1" w:themeTint="BF"/>
       </w:tblBorders>
-      <w:tblCellMar>
-        <w:top w:w="0" w:type="dxa"/>
-        <w:left w:w="108" w:type="dxa"/>
-        <w:bottom w:w="0" w:type="dxa"/>
-        <w:right w:w="108" w:type="dxa"/>
-      </w:tblCellMar>
     </w:tblPr>
     <w:tcPr>
       <w:shd w:val="clear" w:color="auto" w:fill="C0C0C0" w:themeFill="text1" w:themeFillTint="3F"/>
@@ -26913,7 +26108,6 @@
     <w:tblPr>
       <w:tblStyleRowBandSize w:val="1"/>
       <w:tblStyleColBandSize w:val="1"/>
-      <w:tblInd w:w="0" w:type="dxa"/>
       <w:tblBorders>
         <w:top w:val="single" w:sz="8" w:space="0" w:color="7BA0CD" w:themeColor="accent1" w:themeTint="BF"/>
         <w:left w:val="single" w:sz="8" w:space="0" w:color="7BA0CD" w:themeColor="accent1" w:themeTint="BF"/>
@@ -26922,12 +26116,6 @@
         <w:insideH w:val="single" w:sz="8" w:space="0" w:color="7BA0CD" w:themeColor="accent1" w:themeTint="BF"/>
         <w:insideV w:val="single" w:sz="8" w:space="0" w:color="7BA0CD" w:themeColor="accent1" w:themeTint="BF"/>
       </w:tblBorders>
-      <w:tblCellMar>
-        <w:top w:w="0" w:type="dxa"/>
-        <w:left w:w="108" w:type="dxa"/>
-        <w:bottom w:w="0" w:type="dxa"/>
-        <w:right w:w="108" w:type="dxa"/>
-      </w:tblCellMar>
     </w:tblPr>
     <w:tcPr>
       <w:shd w:val="clear" w:color="auto" w:fill="D3DFEE" w:themeFill="accent1" w:themeFillTint="3F"/>
@@ -26986,7 +26174,6 @@
     <w:tblPr>
       <w:tblStyleRowBandSize w:val="1"/>
       <w:tblStyleColBandSize w:val="1"/>
-      <w:tblInd w:w="0" w:type="dxa"/>
       <w:tblBorders>
         <w:top w:val="single" w:sz="8" w:space="0" w:color="CF7B79" w:themeColor="accent2" w:themeTint="BF"/>
         <w:left w:val="single" w:sz="8" w:space="0" w:color="CF7B79" w:themeColor="accent2" w:themeTint="BF"/>
@@ -26995,12 +26182,6 @@
         <w:insideH w:val="single" w:sz="8" w:space="0" w:color="CF7B79" w:themeColor="accent2" w:themeTint="BF"/>
         <w:insideV w:val="single" w:sz="8" w:space="0" w:color="CF7B79" w:themeColor="accent2" w:themeTint="BF"/>
       </w:tblBorders>
-      <w:tblCellMar>
-        <w:top w:w="0" w:type="dxa"/>
-        <w:left w:w="108" w:type="dxa"/>
-        <w:bottom w:w="0" w:type="dxa"/>
-        <w:right w:w="108" w:type="dxa"/>
-      </w:tblCellMar>
     </w:tblPr>
     <w:tcPr>
       <w:shd w:val="clear" w:color="auto" w:fill="EFD3D2" w:themeFill="accent2" w:themeFillTint="3F"/>
@@ -27059,7 +26240,6 @@
     <w:tblPr>
       <w:tblStyleRowBandSize w:val="1"/>
       <w:tblStyleColBandSize w:val="1"/>
-      <w:tblInd w:w="0" w:type="dxa"/>
       <w:tblBorders>
         <w:top w:val="single" w:sz="8" w:space="0" w:color="B3CC82" w:themeColor="accent3" w:themeTint="BF"/>
         <w:left w:val="single" w:sz="8" w:space="0" w:color="B3CC82" w:themeColor="accent3" w:themeTint="BF"/>
@@ -27068,12 +26248,6 @@
         <w:insideH w:val="single" w:sz="8" w:space="0" w:color="B3CC82" w:themeColor="accent3" w:themeTint="BF"/>
         <w:insideV w:val="single" w:sz="8" w:space="0" w:color="B3CC82" w:themeColor="accent3" w:themeTint="BF"/>
       </w:tblBorders>
-      <w:tblCellMar>
-        <w:top w:w="0" w:type="dxa"/>
-        <w:left w:w="108" w:type="dxa"/>
-        <w:bottom w:w="0" w:type="dxa"/>
-        <w:right w:w="108" w:type="dxa"/>
-      </w:tblCellMar>
     </w:tblPr>
     <w:tcPr>
       <w:shd w:val="clear" w:color="auto" w:fill="E6EED5" w:themeFill="accent3" w:themeFillTint="3F"/>
@@ -27132,7 +26306,6 @@
     <w:tblPr>
       <w:tblStyleRowBandSize w:val="1"/>
       <w:tblStyleColBandSize w:val="1"/>
-      <w:tblInd w:w="0" w:type="dxa"/>
       <w:tblBorders>
         <w:top w:val="single" w:sz="8" w:space="0" w:color="9F8AB9" w:themeColor="accent4" w:themeTint="BF"/>
         <w:left w:val="single" w:sz="8" w:space="0" w:color="9F8AB9" w:themeColor="accent4" w:themeTint="BF"/>
@@ -27141,12 +26314,6 @@
         <w:insideH w:val="single" w:sz="8" w:space="0" w:color="9F8AB9" w:themeColor="accent4" w:themeTint="BF"/>
         <w:insideV w:val="single" w:sz="8" w:space="0" w:color="9F8AB9" w:themeColor="accent4" w:themeTint="BF"/>
       </w:tblBorders>
-      <w:tblCellMar>
-        <w:top w:w="0" w:type="dxa"/>
-        <w:left w:w="108" w:type="dxa"/>
-        <w:bottom w:w="0" w:type="dxa"/>
-        <w:right w:w="108" w:type="dxa"/>
-      </w:tblCellMar>
     </w:tblPr>
     <w:tcPr>
       <w:shd w:val="clear" w:color="auto" w:fill="DFD8E8" w:themeFill="accent4" w:themeFillTint="3F"/>
@@ -27205,7 +26372,6 @@
     <w:tblPr>
       <w:tblStyleRowBandSize w:val="1"/>
       <w:tblStyleColBandSize w:val="1"/>
-      <w:tblInd w:w="0" w:type="dxa"/>
       <w:tblBorders>
         <w:top w:val="single" w:sz="8" w:space="0" w:color="78C0D4" w:themeColor="accent5" w:themeTint="BF"/>
         <w:left w:val="single" w:sz="8" w:space="0" w:color="78C0D4" w:themeColor="accent5" w:themeTint="BF"/>
@@ -27214,12 +26380,6 @@
         <w:insideH w:val="single" w:sz="8" w:space="0" w:color="78C0D4" w:themeColor="accent5" w:themeTint="BF"/>
         <w:insideV w:val="single" w:sz="8" w:space="0" w:color="78C0D4" w:themeColor="accent5" w:themeTint="BF"/>
       </w:tblBorders>
-      <w:tblCellMar>
-        <w:top w:w="0" w:type="dxa"/>
-        <w:left w:w="108" w:type="dxa"/>
-        <w:bottom w:w="0" w:type="dxa"/>
-        <w:right w:w="108" w:type="dxa"/>
-      </w:tblCellMar>
     </w:tblPr>
     <w:tcPr>
       <w:shd w:val="clear" w:color="auto" w:fill="D2EAF1" w:themeFill="accent5" w:themeFillTint="3F"/>
@@ -27278,7 +26438,6 @@
     <w:tblPr>
       <w:tblStyleRowBandSize w:val="1"/>
       <w:tblStyleColBandSize w:val="1"/>
-      <w:tblInd w:w="0" w:type="dxa"/>
       <w:tblBorders>
         <w:top w:val="single" w:sz="8" w:space="0" w:color="F9B074" w:themeColor="accent6" w:themeTint="BF"/>
         <w:left w:val="single" w:sz="8" w:space="0" w:color="F9B074" w:themeColor="accent6" w:themeTint="BF"/>
@@ -27287,12 +26446,6 @@
         <w:insideH w:val="single" w:sz="8" w:space="0" w:color="F9B074" w:themeColor="accent6" w:themeTint="BF"/>
         <w:insideV w:val="single" w:sz="8" w:space="0" w:color="F9B074" w:themeColor="accent6" w:themeTint="BF"/>
       </w:tblBorders>
-      <w:tblCellMar>
-        <w:top w:w="0" w:type="dxa"/>
-        <w:left w:w="108" w:type="dxa"/>
-        <w:bottom w:w="0" w:type="dxa"/>
-        <w:right w:w="108" w:type="dxa"/>
-      </w:tblCellMar>
     </w:tblPr>
     <w:tcPr>
       <w:shd w:val="clear" w:color="auto" w:fill="FDE4D0" w:themeFill="accent6" w:themeFillTint="3F"/>
@@ -27355,7 +26508,6 @@
     <w:tblPr>
       <w:tblStyleRowBandSize w:val="1"/>
       <w:tblStyleColBandSize w:val="1"/>
-      <w:tblInd w:w="0" w:type="dxa"/>
       <w:tblBorders>
         <w:top w:val="single" w:sz="8" w:space="0" w:color="000000" w:themeColor="text1"/>
         <w:left w:val="single" w:sz="8" w:space="0" w:color="000000" w:themeColor="text1"/>
@@ -27364,12 +26516,6 @@
         <w:insideH w:val="single" w:sz="8" w:space="0" w:color="000000" w:themeColor="text1"/>
         <w:insideV w:val="single" w:sz="8" w:space="0" w:color="000000" w:themeColor="text1"/>
       </w:tblBorders>
-      <w:tblCellMar>
-        <w:top w:w="0" w:type="dxa"/>
-        <w:left w:w="108" w:type="dxa"/>
-        <w:bottom w:w="0" w:type="dxa"/>
-        <w:right w:w="108" w:type="dxa"/>
-      </w:tblCellMar>
     </w:tblPr>
     <w:tcPr>
       <w:shd w:val="clear" w:color="auto" w:fill="C0C0C0" w:themeFill="text1" w:themeFillTint="3F"/>
@@ -27480,7 +26626,6 @@
     <w:tblPr>
       <w:tblStyleRowBandSize w:val="1"/>
       <w:tblStyleColBandSize w:val="1"/>
-      <w:tblInd w:w="0" w:type="dxa"/>
       <w:tblBorders>
         <w:top w:val="single" w:sz="8" w:space="0" w:color="4F81BD" w:themeColor="accent1"/>
         <w:left w:val="single" w:sz="8" w:space="0" w:color="4F81BD" w:themeColor="accent1"/>
@@ -27489,12 +26634,6 @@
         <w:insideH w:val="single" w:sz="8" w:space="0" w:color="4F81BD" w:themeColor="accent1"/>
         <w:insideV w:val="single" w:sz="8" w:space="0" w:color="4F81BD" w:themeColor="accent1"/>
       </w:tblBorders>
-      <w:tblCellMar>
-        <w:top w:w="0" w:type="dxa"/>
-        <w:left w:w="108" w:type="dxa"/>
-        <w:bottom w:w="0" w:type="dxa"/>
-        <w:right w:w="108" w:type="dxa"/>
-      </w:tblCellMar>
     </w:tblPr>
     <w:tcPr>
       <w:shd w:val="clear" w:color="auto" w:fill="D3DFEE" w:themeFill="accent1" w:themeFillTint="3F"/>
@@ -27605,7 +26744,6 @@
     <w:tblPr>
       <w:tblStyleRowBandSize w:val="1"/>
       <w:tblStyleColBandSize w:val="1"/>
-      <w:tblInd w:w="0" w:type="dxa"/>
       <w:tblBorders>
         <w:top w:val="single" w:sz="8" w:space="0" w:color="C0504D" w:themeColor="accent2"/>
         <w:left w:val="single" w:sz="8" w:space="0" w:color="C0504D" w:themeColor="accent2"/>
@@ -27614,12 +26752,6 @@
         <w:insideH w:val="single" w:sz="8" w:space="0" w:color="C0504D" w:themeColor="accent2"/>
         <w:insideV w:val="single" w:sz="8" w:space="0" w:color="C0504D" w:themeColor="accent2"/>
       </w:tblBorders>
-      <w:tblCellMar>
-        <w:top w:w="0" w:type="dxa"/>
-        <w:left w:w="108" w:type="dxa"/>
-        <w:bottom w:w="0" w:type="dxa"/>
-        <w:right w:w="108" w:type="dxa"/>
-      </w:tblCellMar>
     </w:tblPr>
     <w:tcPr>
       <w:shd w:val="clear" w:color="auto" w:fill="EFD3D2" w:themeFill="accent2" w:themeFillTint="3F"/>
@@ -27730,7 +26862,6 @@
     <w:tblPr>
       <w:tblStyleRowBandSize w:val="1"/>
       <w:tblStyleColBandSize w:val="1"/>
-      <w:tblInd w:w="0" w:type="dxa"/>
       <w:tblBorders>
         <w:top w:val="single" w:sz="8" w:space="0" w:color="9BBB59" w:themeColor="accent3"/>
         <w:left w:val="single" w:sz="8" w:space="0" w:color="9BBB59" w:themeColor="accent3"/>
@@ -27739,12 +26870,6 @@
         <w:insideH w:val="single" w:sz="8" w:space="0" w:color="9BBB59" w:themeColor="accent3"/>
         <w:insideV w:val="single" w:sz="8" w:space="0" w:color="9BBB59" w:themeColor="accent3"/>
       </w:tblBorders>
-      <w:tblCellMar>
-        <w:top w:w="0" w:type="dxa"/>
-        <w:left w:w="108" w:type="dxa"/>
-        <w:bottom w:w="0" w:type="dxa"/>
-        <w:right w:w="108" w:type="dxa"/>
-      </w:tblCellMar>
     </w:tblPr>
     <w:tcPr>
       <w:shd w:val="clear" w:color="auto" w:fill="E6EED5" w:themeFill="accent3" w:themeFillTint="3F"/>
@@ -27855,7 +26980,6 @@
     <w:tblPr>
       <w:tblStyleRowBandSize w:val="1"/>
       <w:tblStyleColBandSize w:val="1"/>
-      <w:tblInd w:w="0" w:type="dxa"/>
       <w:tblBorders>
         <w:top w:val="single" w:sz="8" w:space="0" w:color="8064A2" w:themeColor="accent4"/>
         <w:left w:val="single" w:sz="8" w:space="0" w:color="8064A2" w:themeColor="accent4"/>
@@ -27864,12 +26988,6 @@
         <w:insideH w:val="single" w:sz="8" w:space="0" w:color="8064A2" w:themeColor="accent4"/>
         <w:insideV w:val="single" w:sz="8" w:space="0" w:color="8064A2" w:themeColor="accent4"/>
       </w:tblBorders>
-      <w:tblCellMar>
-        <w:top w:w="0" w:type="dxa"/>
-        <w:left w:w="108" w:type="dxa"/>
-        <w:bottom w:w="0" w:type="dxa"/>
-        <w:right w:w="108" w:type="dxa"/>
-      </w:tblCellMar>
     </w:tblPr>
     <w:tcPr>
       <w:shd w:val="clear" w:color="auto" w:fill="DFD8E8" w:themeFill="accent4" w:themeFillTint="3F"/>
@@ -27980,7 +27098,6 @@
     <w:tblPr>
       <w:tblStyleRowBandSize w:val="1"/>
       <w:tblStyleColBandSize w:val="1"/>
-      <w:tblInd w:w="0" w:type="dxa"/>
       <w:tblBorders>
         <w:top w:val="single" w:sz="8" w:space="0" w:color="4BACC6" w:themeColor="accent5"/>
         <w:left w:val="single" w:sz="8" w:space="0" w:color="4BACC6" w:themeColor="accent5"/>
@@ -27989,12 +27106,6 @@
         <w:insideH w:val="single" w:sz="8" w:space="0" w:color="4BACC6" w:themeColor="accent5"/>
         <w:insideV w:val="single" w:sz="8" w:space="0" w:color="4BACC6" w:themeColor="accent5"/>
       </w:tblBorders>
-      <w:tblCellMar>
-        <w:top w:w="0" w:type="dxa"/>
-        <w:left w:w="108" w:type="dxa"/>
-        <w:bottom w:w="0" w:type="dxa"/>
-        <w:right w:w="108" w:type="dxa"/>
-      </w:tblCellMar>
     </w:tblPr>
     <w:tcPr>
       <w:shd w:val="clear" w:color="auto" w:fill="D2EAF1" w:themeFill="accent5" w:themeFillTint="3F"/>
@@ -28105,7 +27216,6 @@
     <w:tblPr>
       <w:tblStyleRowBandSize w:val="1"/>
       <w:tblStyleColBandSize w:val="1"/>
-      <w:tblInd w:w="0" w:type="dxa"/>
       <w:tblBorders>
         <w:top w:val="single" w:sz="8" w:space="0" w:color="F79646" w:themeColor="accent6"/>
         <w:left w:val="single" w:sz="8" w:space="0" w:color="F79646" w:themeColor="accent6"/>
@@ -28114,12 +27224,6 @@
         <w:insideH w:val="single" w:sz="8" w:space="0" w:color="F79646" w:themeColor="accent6"/>
         <w:insideV w:val="single" w:sz="8" w:space="0" w:color="F79646" w:themeColor="accent6"/>
       </w:tblBorders>
-      <w:tblCellMar>
-        <w:top w:w="0" w:type="dxa"/>
-        <w:left w:w="108" w:type="dxa"/>
-        <w:bottom w:w="0" w:type="dxa"/>
-        <w:right w:w="108" w:type="dxa"/>
-      </w:tblCellMar>
     </w:tblPr>
     <w:tcPr>
       <w:shd w:val="clear" w:color="auto" w:fill="FDE4D0" w:themeFill="accent6" w:themeFillTint="3F"/>
@@ -28226,7 +27330,6 @@
     <w:tblPr>
       <w:tblStyleRowBandSize w:val="1"/>
       <w:tblStyleColBandSize w:val="1"/>
-      <w:tblInd w:w="0" w:type="dxa"/>
       <w:tblBorders>
         <w:top w:val="single" w:sz="8" w:space="0" w:color="FFFFFF" w:themeColor="background1"/>
         <w:left w:val="single" w:sz="8" w:space="0" w:color="FFFFFF" w:themeColor="background1"/>
@@ -28235,12 +27338,6 @@
         <w:insideH w:val="single" w:sz="6" w:space="0" w:color="FFFFFF" w:themeColor="background1"/>
         <w:insideV w:val="single" w:sz="6" w:space="0" w:color="FFFFFF" w:themeColor="background1"/>
       </w:tblBorders>
-      <w:tblCellMar>
-        <w:top w:w="0" w:type="dxa"/>
-        <w:left w:w="108" w:type="dxa"/>
-        <w:bottom w:w="0" w:type="dxa"/>
-        <w:right w:w="108" w:type="dxa"/>
-      </w:tblCellMar>
     </w:tblPr>
     <w:tcPr>
       <w:shd w:val="clear" w:color="auto" w:fill="C0C0C0" w:themeFill="text1" w:themeFillTint="3F"/>
@@ -28367,7 +27464,6 @@
     <w:tblPr>
       <w:tblStyleRowBandSize w:val="1"/>
       <w:tblStyleColBandSize w:val="1"/>
-      <w:tblInd w:w="0" w:type="dxa"/>
       <w:tblBorders>
         <w:top w:val="single" w:sz="8" w:space="0" w:color="FFFFFF" w:themeColor="background1"/>
         <w:left w:val="single" w:sz="8" w:space="0" w:color="FFFFFF" w:themeColor="background1"/>
@@ -28376,12 +27472,6 @@
         <w:insideH w:val="single" w:sz="6" w:space="0" w:color="FFFFFF" w:themeColor="background1"/>
         <w:insideV w:val="single" w:sz="6" w:space="0" w:color="FFFFFF" w:themeColor="background1"/>
       </w:tblBorders>
-      <w:tblCellMar>
-        <w:top w:w="0" w:type="dxa"/>
-        <w:left w:w="108" w:type="dxa"/>
-        <w:bottom w:w="0" w:type="dxa"/>
-        <w:right w:w="108" w:type="dxa"/>
-      </w:tblCellMar>
     </w:tblPr>
     <w:tcPr>
       <w:shd w:val="clear" w:color="auto" w:fill="D3DFEE" w:themeFill="accent1" w:themeFillTint="3F"/>
@@ -28508,7 +27598,6 @@
     <w:tblPr>
       <w:tblStyleRowBandSize w:val="1"/>
       <w:tblStyleColBandSize w:val="1"/>
-      <w:tblInd w:w="0" w:type="dxa"/>
       <w:tblBorders>
         <w:top w:val="single" w:sz="8" w:space="0" w:color="FFFFFF" w:themeColor="background1"/>
         <w:left w:val="single" w:sz="8" w:space="0" w:color="FFFFFF" w:themeColor="background1"/>
@@ -28517,12 +27606,6 @@
         <w:insideH w:val="single" w:sz="6" w:space="0" w:color="FFFFFF" w:themeColor="background1"/>
         <w:insideV w:val="single" w:sz="6" w:space="0" w:color="FFFFFF" w:themeColor="background1"/>
       </w:tblBorders>
-      <w:tblCellMar>
-        <w:top w:w="0" w:type="dxa"/>
-        <w:left w:w="108" w:type="dxa"/>
-        <w:bottom w:w="0" w:type="dxa"/>
-        <w:right w:w="108" w:type="dxa"/>
-      </w:tblCellMar>
     </w:tblPr>
     <w:tcPr>
       <w:shd w:val="clear" w:color="auto" w:fill="EFD3D2" w:themeFill="accent2" w:themeFillTint="3F"/>
@@ -28649,7 +27732,6 @@
     <w:tblPr>
       <w:tblStyleRowBandSize w:val="1"/>
       <w:tblStyleColBandSize w:val="1"/>
-      <w:tblInd w:w="0" w:type="dxa"/>
       <w:tblBorders>
         <w:top w:val="single" w:sz="8" w:space="0" w:color="FFFFFF" w:themeColor="background1"/>
         <w:left w:val="single" w:sz="8" w:space="0" w:color="FFFFFF" w:themeColor="background1"/>
@@ -28658,12 +27740,6 @@
         <w:insideH w:val="single" w:sz="6" w:space="0" w:color="FFFFFF" w:themeColor="background1"/>
         <w:insideV w:val="single" w:sz="6" w:space="0" w:color="FFFFFF" w:themeColor="background1"/>
       </w:tblBorders>
-      <w:tblCellMar>
-        <w:top w:w="0" w:type="dxa"/>
-        <w:left w:w="108" w:type="dxa"/>
-        <w:bottom w:w="0" w:type="dxa"/>
-        <w:right w:w="108" w:type="dxa"/>
-      </w:tblCellMar>
     </w:tblPr>
     <w:tcPr>
       <w:shd w:val="clear" w:color="auto" w:fill="E6EED5" w:themeFill="accent3" w:themeFillTint="3F"/>
@@ -28790,7 +27866,6 @@
     <w:tblPr>
       <w:tblStyleRowBandSize w:val="1"/>
       <w:tblStyleColBandSize w:val="1"/>
-      <w:tblInd w:w="0" w:type="dxa"/>
       <w:tblBorders>
         <w:top w:val="single" w:sz="8" w:space="0" w:color="FFFFFF" w:themeColor="background1"/>
         <w:left w:val="single" w:sz="8" w:space="0" w:color="FFFFFF" w:themeColor="background1"/>
@@ -28799,12 +27874,6 @@
         <w:insideH w:val="single" w:sz="6" w:space="0" w:color="FFFFFF" w:themeColor="background1"/>
         <w:insideV w:val="single" w:sz="6" w:space="0" w:color="FFFFFF" w:themeColor="background1"/>
       </w:tblBorders>
-      <w:tblCellMar>
-        <w:top w:w="0" w:type="dxa"/>
-        <w:left w:w="108" w:type="dxa"/>
-        <w:bottom w:w="0" w:type="dxa"/>
-        <w:right w:w="108" w:type="dxa"/>
-      </w:tblCellMar>
     </w:tblPr>
     <w:tcPr>
       <w:shd w:val="clear" w:color="auto" w:fill="DFD8E8" w:themeFill="accent4" w:themeFillTint="3F"/>
@@ -28931,7 +28000,6 @@
     <w:tblPr>
       <w:tblStyleRowBandSize w:val="1"/>
       <w:tblStyleColBandSize w:val="1"/>
-      <w:tblInd w:w="0" w:type="dxa"/>
       <w:tblBorders>
         <w:top w:val="single" w:sz="8" w:space="0" w:color="FFFFFF" w:themeColor="background1"/>
         <w:left w:val="single" w:sz="8" w:space="0" w:color="FFFFFF" w:themeColor="background1"/>
@@ -28940,12 +28008,6 @@
         <w:insideH w:val="single" w:sz="6" w:space="0" w:color="FFFFFF" w:themeColor="background1"/>
         <w:insideV w:val="single" w:sz="6" w:space="0" w:color="FFFFFF" w:themeColor="background1"/>
       </w:tblBorders>
-      <w:tblCellMar>
-        <w:top w:w="0" w:type="dxa"/>
-        <w:left w:w="108" w:type="dxa"/>
-        <w:bottom w:w="0" w:type="dxa"/>
-        <w:right w:w="108" w:type="dxa"/>
-      </w:tblCellMar>
     </w:tblPr>
     <w:tcPr>
       <w:shd w:val="clear" w:color="auto" w:fill="D2EAF1" w:themeFill="accent5" w:themeFillTint="3F"/>
@@ -29072,7 +28134,6 @@
     <w:tblPr>
       <w:tblStyleRowBandSize w:val="1"/>
       <w:tblStyleColBandSize w:val="1"/>
-      <w:tblInd w:w="0" w:type="dxa"/>
       <w:tblBorders>
         <w:top w:val="single" w:sz="8" w:space="0" w:color="FFFFFF" w:themeColor="background1"/>
         <w:left w:val="single" w:sz="8" w:space="0" w:color="FFFFFF" w:themeColor="background1"/>
@@ -29081,12 +28142,6 @@
         <w:insideH w:val="single" w:sz="6" w:space="0" w:color="FFFFFF" w:themeColor="background1"/>
         <w:insideV w:val="single" w:sz="6" w:space="0" w:color="FFFFFF" w:themeColor="background1"/>
       </w:tblBorders>
-      <w:tblCellMar>
-        <w:top w:w="0" w:type="dxa"/>
-        <w:left w:w="108" w:type="dxa"/>
-        <w:bottom w:w="0" w:type="dxa"/>
-        <w:right w:w="108" w:type="dxa"/>
-      </w:tblCellMar>
     </w:tblPr>
     <w:tcPr>
       <w:shd w:val="clear" w:color="auto" w:fill="FDE4D0" w:themeFill="accent6" w:themeFillTint="3F"/>
@@ -29216,13 +28271,6 @@
     <w:tblPr>
       <w:tblStyleRowBandSize w:val="1"/>
       <w:tblStyleColBandSize w:val="1"/>
-      <w:tblInd w:w="0" w:type="dxa"/>
-      <w:tblCellMar>
-        <w:top w:w="0" w:type="dxa"/>
-        <w:left w:w="108" w:type="dxa"/>
-        <w:bottom w:w="0" w:type="dxa"/>
-        <w:right w:w="108" w:type="dxa"/>
-      </w:tblCellMar>
     </w:tblPr>
     <w:tcPr>
       <w:shd w:val="clear" w:color="auto" w:fill="000000" w:themeFill="text1"/>
@@ -29330,13 +28378,6 @@
     <w:tblPr>
       <w:tblStyleRowBandSize w:val="1"/>
       <w:tblStyleColBandSize w:val="1"/>
-      <w:tblInd w:w="0" w:type="dxa"/>
-      <w:tblCellMar>
-        <w:top w:w="0" w:type="dxa"/>
-        <w:left w:w="108" w:type="dxa"/>
-        <w:bottom w:w="0" w:type="dxa"/>
-        <w:right w:w="108" w:type="dxa"/>
-      </w:tblCellMar>
     </w:tblPr>
     <w:tcPr>
       <w:shd w:val="clear" w:color="auto" w:fill="4F81BD" w:themeFill="accent1"/>
@@ -29444,13 +28485,6 @@
     <w:tblPr>
       <w:tblStyleRowBandSize w:val="1"/>
       <w:tblStyleColBandSize w:val="1"/>
-      <w:tblInd w:w="0" w:type="dxa"/>
-      <w:tblCellMar>
-        <w:top w:w="0" w:type="dxa"/>
-        <w:left w:w="108" w:type="dxa"/>
-        <w:bottom w:w="0" w:type="dxa"/>
-        <w:right w:w="108" w:type="dxa"/>
-      </w:tblCellMar>
     </w:tblPr>
     <w:tcPr>
       <w:shd w:val="clear" w:color="auto" w:fill="C0504D" w:themeFill="accent2"/>
@@ -29558,13 +28592,6 @@
     <w:tblPr>
       <w:tblStyleRowBandSize w:val="1"/>
       <w:tblStyleColBandSize w:val="1"/>
-      <w:tblInd w:w="0" w:type="dxa"/>
-      <w:tblCellMar>
-        <w:top w:w="0" w:type="dxa"/>
-        <w:left w:w="108" w:type="dxa"/>
-        <w:bottom w:w="0" w:type="dxa"/>
-        <w:right w:w="108" w:type="dxa"/>
-      </w:tblCellMar>
     </w:tblPr>
     <w:tcPr>
       <w:shd w:val="clear" w:color="auto" w:fill="9BBB59" w:themeFill="accent3"/>
@@ -29672,13 +28699,6 @@
     <w:tblPr>
       <w:tblStyleRowBandSize w:val="1"/>
       <w:tblStyleColBandSize w:val="1"/>
-      <w:tblInd w:w="0" w:type="dxa"/>
-      <w:tblCellMar>
-        <w:top w:w="0" w:type="dxa"/>
-        <w:left w:w="108" w:type="dxa"/>
-        <w:bottom w:w="0" w:type="dxa"/>
-        <w:right w:w="108" w:type="dxa"/>
-      </w:tblCellMar>
     </w:tblPr>
     <w:tcPr>
       <w:shd w:val="clear" w:color="auto" w:fill="8064A2" w:themeFill="accent4"/>
@@ -29786,13 +28806,6 @@
     <w:tblPr>
       <w:tblStyleRowBandSize w:val="1"/>
       <w:tblStyleColBandSize w:val="1"/>
-      <w:tblInd w:w="0" w:type="dxa"/>
-      <w:tblCellMar>
-        <w:top w:w="0" w:type="dxa"/>
-        <w:left w:w="108" w:type="dxa"/>
-        <w:bottom w:w="0" w:type="dxa"/>
-        <w:right w:w="108" w:type="dxa"/>
-      </w:tblCellMar>
     </w:tblPr>
     <w:tcPr>
       <w:shd w:val="clear" w:color="auto" w:fill="4BACC6" w:themeFill="accent5"/>
@@ -29900,13 +28913,6 @@
     <w:tblPr>
       <w:tblStyleRowBandSize w:val="1"/>
       <w:tblStyleColBandSize w:val="1"/>
-      <w:tblInd w:w="0" w:type="dxa"/>
-      <w:tblCellMar>
-        <w:top w:w="0" w:type="dxa"/>
-        <w:left w:w="108" w:type="dxa"/>
-        <w:bottom w:w="0" w:type="dxa"/>
-        <w:right w:w="108" w:type="dxa"/>
-      </w:tblCellMar>
     </w:tblPr>
     <w:tcPr>
       <w:shd w:val="clear" w:color="auto" w:fill="F79646" w:themeFill="accent6"/>
@@ -30014,7 +29020,6 @@
     <w:tblPr>
       <w:tblStyleRowBandSize w:val="1"/>
       <w:tblStyleColBandSize w:val="1"/>
-      <w:tblInd w:w="0" w:type="dxa"/>
       <w:tblBorders>
         <w:top w:val="single" w:sz="24" w:space="0" w:color="C0504D" w:themeColor="accent2"/>
         <w:left w:val="single" w:sz="4" w:space="0" w:color="000000" w:themeColor="text1"/>
@@ -30023,12 +29028,6 @@
         <w:insideH w:val="single" w:sz="4" w:space="0" w:color="FFFFFF" w:themeColor="background1"/>
         <w:insideV w:val="single" w:sz="4" w:space="0" w:color="FFFFFF" w:themeColor="background1"/>
       </w:tblBorders>
-      <w:tblCellMar>
-        <w:top w:w="0" w:type="dxa"/>
-        <w:left w:w="108" w:type="dxa"/>
-        <w:bottom w:w="0" w:type="dxa"/>
-        <w:right w:w="108" w:type="dxa"/>
-      </w:tblCellMar>
     </w:tblPr>
     <w:tcPr>
       <w:shd w:val="clear" w:color="auto" w:fill="E6E6E6" w:themeFill="text1" w:themeFillTint="19"/>
@@ -30136,7 +29135,6 @@
     <w:tblPr>
       <w:tblStyleRowBandSize w:val="1"/>
       <w:tblStyleColBandSize w:val="1"/>
-      <w:tblInd w:w="0" w:type="dxa"/>
       <w:tblBorders>
         <w:top w:val="single" w:sz="24" w:space="0" w:color="C0504D" w:themeColor="accent2"/>
         <w:left w:val="single" w:sz="4" w:space="0" w:color="4F81BD" w:themeColor="accent1"/>
@@ -30145,12 +29143,6 @@
         <w:insideH w:val="single" w:sz="4" w:space="0" w:color="FFFFFF" w:themeColor="background1"/>
         <w:insideV w:val="single" w:sz="4" w:space="0" w:color="FFFFFF" w:themeColor="background1"/>
       </w:tblBorders>
-      <w:tblCellMar>
-        <w:top w:w="0" w:type="dxa"/>
-        <w:left w:w="108" w:type="dxa"/>
-        <w:bottom w:w="0" w:type="dxa"/>
-        <w:right w:w="108" w:type="dxa"/>
-      </w:tblCellMar>
     </w:tblPr>
     <w:tcPr>
       <w:shd w:val="clear" w:color="auto" w:fill="EDF2F8" w:themeFill="accent1" w:themeFillTint="19"/>
@@ -30258,7 +29250,6 @@
     <w:tblPr>
       <w:tblStyleRowBandSize w:val="1"/>
       <w:tblStyleColBandSize w:val="1"/>
-      <w:tblInd w:w="0" w:type="dxa"/>
       <w:tblBorders>
         <w:top w:val="single" w:sz="24" w:space="0" w:color="C0504D" w:themeColor="accent2"/>
         <w:left w:val="single" w:sz="4" w:space="0" w:color="C0504D" w:themeColor="accent2"/>
@@ -30267,12 +29258,6 @@
         <w:insideH w:val="single" w:sz="4" w:space="0" w:color="FFFFFF" w:themeColor="background1"/>
         <w:insideV w:val="single" w:sz="4" w:space="0" w:color="FFFFFF" w:themeColor="background1"/>
       </w:tblBorders>
-      <w:tblCellMar>
-        <w:top w:w="0" w:type="dxa"/>
-        <w:left w:w="108" w:type="dxa"/>
-        <w:bottom w:w="0" w:type="dxa"/>
-        <w:right w:w="108" w:type="dxa"/>
-      </w:tblCellMar>
     </w:tblPr>
     <w:tcPr>
       <w:shd w:val="clear" w:color="auto" w:fill="F8EDED" w:themeFill="accent2" w:themeFillTint="19"/>
@@ -30380,7 +29365,6 @@
     <w:tblPr>
       <w:tblStyleRowBandSize w:val="1"/>
       <w:tblStyleColBandSize w:val="1"/>
-      <w:tblInd w:w="0" w:type="dxa"/>
       <w:tblBorders>
         <w:top w:val="single" w:sz="24" w:space="0" w:color="8064A2" w:themeColor="accent4"/>
         <w:left w:val="single" w:sz="4" w:space="0" w:color="9BBB59" w:themeColor="accent3"/>
@@ -30389,12 +29373,6 @@
         <w:insideH w:val="single" w:sz="4" w:space="0" w:color="FFFFFF" w:themeColor="background1"/>
         <w:insideV w:val="single" w:sz="4" w:space="0" w:color="FFFFFF" w:themeColor="background1"/>
       </w:tblBorders>
-      <w:tblCellMar>
-        <w:top w:w="0" w:type="dxa"/>
-        <w:left w:w="108" w:type="dxa"/>
-        <w:bottom w:w="0" w:type="dxa"/>
-        <w:right w:w="108" w:type="dxa"/>
-      </w:tblCellMar>
     </w:tblPr>
     <w:tcPr>
       <w:shd w:val="clear" w:color="auto" w:fill="F5F8EE" w:themeFill="accent3" w:themeFillTint="19"/>
@@ -30492,7 +29470,6 @@
     <w:tblPr>
       <w:tblStyleRowBandSize w:val="1"/>
       <w:tblStyleColBandSize w:val="1"/>
-      <w:tblInd w:w="0" w:type="dxa"/>
       <w:tblBorders>
         <w:top w:val="single" w:sz="24" w:space="0" w:color="9BBB59" w:themeColor="accent3"/>
         <w:left w:val="single" w:sz="4" w:space="0" w:color="8064A2" w:themeColor="accent4"/>
@@ -30501,12 +29478,6 @@
         <w:insideH w:val="single" w:sz="4" w:space="0" w:color="FFFFFF" w:themeColor="background1"/>
         <w:insideV w:val="single" w:sz="4" w:space="0" w:color="FFFFFF" w:themeColor="background1"/>
       </w:tblBorders>
-      <w:tblCellMar>
-        <w:top w:w="0" w:type="dxa"/>
-        <w:left w:w="108" w:type="dxa"/>
-        <w:bottom w:w="0" w:type="dxa"/>
-        <w:right w:w="108" w:type="dxa"/>
-      </w:tblCellMar>
     </w:tblPr>
     <w:tcPr>
       <w:shd w:val="clear" w:color="auto" w:fill="F2EFF6" w:themeFill="accent4" w:themeFillTint="19"/>
@@ -30614,7 +29585,6 @@
     <w:tblPr>
       <w:tblStyleRowBandSize w:val="1"/>
       <w:tblStyleColBandSize w:val="1"/>
-      <w:tblInd w:w="0" w:type="dxa"/>
       <w:tblBorders>
         <w:top w:val="single" w:sz="24" w:space="0" w:color="F79646" w:themeColor="accent6"/>
         <w:left w:val="single" w:sz="4" w:space="0" w:color="4BACC6" w:themeColor="accent5"/>
@@ -30623,12 +29593,6 @@
         <w:insideH w:val="single" w:sz="4" w:space="0" w:color="FFFFFF" w:themeColor="background1"/>
         <w:insideV w:val="single" w:sz="4" w:space="0" w:color="FFFFFF" w:themeColor="background1"/>
       </w:tblBorders>
-      <w:tblCellMar>
-        <w:top w:w="0" w:type="dxa"/>
-        <w:left w:w="108" w:type="dxa"/>
-        <w:bottom w:w="0" w:type="dxa"/>
-        <w:right w:w="108" w:type="dxa"/>
-      </w:tblCellMar>
     </w:tblPr>
     <w:tcPr>
       <w:shd w:val="clear" w:color="auto" w:fill="EDF6F9" w:themeFill="accent5" w:themeFillTint="19"/>
@@ -30736,7 +29700,6 @@
     <w:tblPr>
       <w:tblStyleRowBandSize w:val="1"/>
       <w:tblStyleColBandSize w:val="1"/>
-      <w:tblInd w:w="0" w:type="dxa"/>
       <w:tblBorders>
         <w:top w:val="single" w:sz="24" w:space="0" w:color="4BACC6" w:themeColor="accent5"/>
         <w:left w:val="single" w:sz="4" w:space="0" w:color="F79646" w:themeColor="accent6"/>
@@ -30745,12 +29708,6 @@
         <w:insideH w:val="single" w:sz="4" w:space="0" w:color="FFFFFF" w:themeColor="background1"/>
         <w:insideV w:val="single" w:sz="4" w:space="0" w:color="FFFFFF" w:themeColor="background1"/>
       </w:tblBorders>
-      <w:tblCellMar>
-        <w:top w:w="0" w:type="dxa"/>
-        <w:left w:w="108" w:type="dxa"/>
-        <w:bottom w:w="0" w:type="dxa"/>
-        <w:right w:w="108" w:type="dxa"/>
-      </w:tblCellMar>
     </w:tblPr>
     <w:tcPr>
       <w:shd w:val="clear" w:color="auto" w:fill="FEF4EC" w:themeFill="accent6" w:themeFillTint="19"/>
@@ -30858,13 +29815,6 @@
     <w:tblPr>
       <w:tblStyleRowBandSize w:val="1"/>
       <w:tblStyleColBandSize w:val="1"/>
-      <w:tblInd w:w="0" w:type="dxa"/>
-      <w:tblCellMar>
-        <w:top w:w="0" w:type="dxa"/>
-        <w:left w:w="108" w:type="dxa"/>
-        <w:bottom w:w="0" w:type="dxa"/>
-        <w:right w:w="108" w:type="dxa"/>
-      </w:tblCellMar>
     </w:tblPr>
     <w:tcPr>
       <w:shd w:val="clear" w:color="auto" w:fill="E6E6E6" w:themeFill="text1" w:themeFillTint="19"/>
@@ -30944,13 +29894,6 @@
     <w:tblPr>
       <w:tblStyleRowBandSize w:val="1"/>
       <w:tblStyleColBandSize w:val="1"/>
-      <w:tblInd w:w="0" w:type="dxa"/>
-      <w:tblCellMar>
-        <w:top w:w="0" w:type="dxa"/>
-        <w:left w:w="108" w:type="dxa"/>
-        <w:bottom w:w="0" w:type="dxa"/>
-        <w:right w:w="108" w:type="dxa"/>
-      </w:tblCellMar>
     </w:tblPr>
     <w:tcPr>
       <w:shd w:val="clear" w:color="auto" w:fill="EDF2F8" w:themeFill="accent1" w:themeFillTint="19"/>
@@ -31030,13 +29973,6 @@
     <w:tblPr>
       <w:tblStyleRowBandSize w:val="1"/>
       <w:tblStyleColBandSize w:val="1"/>
-      <w:tblInd w:w="0" w:type="dxa"/>
-      <w:tblCellMar>
-        <w:top w:w="0" w:type="dxa"/>
-        <w:left w:w="108" w:type="dxa"/>
-        <w:bottom w:w="0" w:type="dxa"/>
-        <w:right w:w="108" w:type="dxa"/>
-      </w:tblCellMar>
     </w:tblPr>
     <w:tcPr>
       <w:shd w:val="clear" w:color="auto" w:fill="F8EDED" w:themeFill="accent2" w:themeFillTint="19"/>
@@ -31116,13 +30052,6 @@
     <w:tblPr>
       <w:tblStyleRowBandSize w:val="1"/>
       <w:tblStyleColBandSize w:val="1"/>
-      <w:tblInd w:w="0" w:type="dxa"/>
-      <w:tblCellMar>
-        <w:top w:w="0" w:type="dxa"/>
-        <w:left w:w="108" w:type="dxa"/>
-        <w:bottom w:w="0" w:type="dxa"/>
-        <w:right w:w="108" w:type="dxa"/>
-      </w:tblCellMar>
     </w:tblPr>
     <w:tcPr>
       <w:shd w:val="clear" w:color="auto" w:fill="F5F8EE" w:themeFill="accent3" w:themeFillTint="19"/>
@@ -31202,13 +30131,6 @@
     <w:tblPr>
       <w:tblStyleRowBandSize w:val="1"/>
       <w:tblStyleColBandSize w:val="1"/>
-      <w:tblInd w:w="0" w:type="dxa"/>
-      <w:tblCellMar>
-        <w:top w:w="0" w:type="dxa"/>
-        <w:left w:w="108" w:type="dxa"/>
-        <w:bottom w:w="0" w:type="dxa"/>
-        <w:right w:w="108" w:type="dxa"/>
-      </w:tblCellMar>
     </w:tblPr>
     <w:tcPr>
       <w:shd w:val="clear" w:color="auto" w:fill="F2EFF6" w:themeFill="accent4" w:themeFillTint="19"/>
@@ -31288,13 +30210,6 @@
     <w:tblPr>
       <w:tblStyleRowBandSize w:val="1"/>
       <w:tblStyleColBandSize w:val="1"/>
-      <w:tblInd w:w="0" w:type="dxa"/>
-      <w:tblCellMar>
-        <w:top w:w="0" w:type="dxa"/>
-        <w:left w:w="108" w:type="dxa"/>
-        <w:bottom w:w="0" w:type="dxa"/>
-        <w:right w:w="108" w:type="dxa"/>
-      </w:tblCellMar>
     </w:tblPr>
     <w:tcPr>
       <w:shd w:val="clear" w:color="auto" w:fill="EDF6F9" w:themeFill="accent5" w:themeFillTint="19"/>
@@ -31374,13 +30289,6 @@
     <w:tblPr>
       <w:tblStyleRowBandSize w:val="1"/>
       <w:tblStyleColBandSize w:val="1"/>
-      <w:tblInd w:w="0" w:type="dxa"/>
-      <w:tblCellMar>
-        <w:top w:w="0" w:type="dxa"/>
-        <w:left w:w="108" w:type="dxa"/>
-        <w:bottom w:w="0" w:type="dxa"/>
-        <w:right w:w="108" w:type="dxa"/>
-      </w:tblCellMar>
     </w:tblPr>
     <w:tcPr>
       <w:shd w:val="clear" w:color="auto" w:fill="FEF4EC" w:themeFill="accent6" w:themeFillTint="19"/>
@@ -31460,16 +30368,9 @@
     <w:tblPr>
       <w:tblStyleRowBandSize w:val="1"/>
       <w:tblStyleColBandSize w:val="1"/>
-      <w:tblInd w:w="0" w:type="dxa"/>
       <w:tblBorders>
         <w:insideH w:val="single" w:sz="4" w:space="0" w:color="FFFFFF" w:themeColor="background1"/>
       </w:tblBorders>
-      <w:tblCellMar>
-        <w:top w:w="0" w:type="dxa"/>
-        <w:left w:w="108" w:type="dxa"/>
-        <w:bottom w:w="0" w:type="dxa"/>
-        <w:right w:w="108" w:type="dxa"/>
-      </w:tblCellMar>
     </w:tblPr>
     <w:tcPr>
       <w:shd w:val="clear" w:color="auto" w:fill="CCCCCC" w:themeFill="text1" w:themeFillTint="33"/>
@@ -31540,16 +30441,9 @@
     <w:tblPr>
       <w:tblStyleRowBandSize w:val="1"/>
       <w:tblStyleColBandSize w:val="1"/>
-      <w:tblInd w:w="0" w:type="dxa"/>
       <w:tblBorders>
         <w:insideH w:val="single" w:sz="4" w:space="0" w:color="FFFFFF" w:themeColor="background1"/>
       </w:tblBorders>
-      <w:tblCellMar>
-        <w:top w:w="0" w:type="dxa"/>
-        <w:left w:w="108" w:type="dxa"/>
-        <w:bottom w:w="0" w:type="dxa"/>
-        <w:right w:w="108" w:type="dxa"/>
-      </w:tblCellMar>
     </w:tblPr>
     <w:tcPr>
       <w:shd w:val="clear" w:color="auto" w:fill="DBE5F1" w:themeFill="accent1" w:themeFillTint="33"/>
@@ -31620,16 +30514,9 @@
     <w:tblPr>
       <w:tblStyleRowBandSize w:val="1"/>
       <w:tblStyleColBandSize w:val="1"/>
-      <w:tblInd w:w="0" w:type="dxa"/>
       <w:tblBorders>
         <w:insideH w:val="single" w:sz="4" w:space="0" w:color="FFFFFF" w:themeColor="background1"/>
       </w:tblBorders>
-      <w:tblCellMar>
-        <w:top w:w="0" w:type="dxa"/>
-        <w:left w:w="108" w:type="dxa"/>
-        <w:bottom w:w="0" w:type="dxa"/>
-        <w:right w:w="108" w:type="dxa"/>
-      </w:tblCellMar>
     </w:tblPr>
     <w:tcPr>
       <w:shd w:val="clear" w:color="auto" w:fill="F2DBDB" w:themeFill="accent2" w:themeFillTint="33"/>
@@ -31700,16 +30587,9 @@
     <w:tblPr>
       <w:tblStyleRowBandSize w:val="1"/>
       <w:tblStyleColBandSize w:val="1"/>
-      <w:tblInd w:w="0" w:type="dxa"/>
       <w:tblBorders>
         <w:insideH w:val="single" w:sz="4" w:space="0" w:color="FFFFFF" w:themeColor="background1"/>
       </w:tblBorders>
-      <w:tblCellMar>
-        <w:top w:w="0" w:type="dxa"/>
-        <w:left w:w="108" w:type="dxa"/>
-        <w:bottom w:w="0" w:type="dxa"/>
-        <w:right w:w="108" w:type="dxa"/>
-      </w:tblCellMar>
     </w:tblPr>
     <w:tcPr>
       <w:shd w:val="clear" w:color="auto" w:fill="EAF1DD" w:themeFill="accent3" w:themeFillTint="33"/>
@@ -31780,16 +30660,9 @@
     <w:tblPr>
       <w:tblStyleRowBandSize w:val="1"/>
       <w:tblStyleColBandSize w:val="1"/>
-      <w:tblInd w:w="0" w:type="dxa"/>
       <w:tblBorders>
         <w:insideH w:val="single" w:sz="4" w:space="0" w:color="FFFFFF" w:themeColor="background1"/>
       </w:tblBorders>
-      <w:tblCellMar>
-        <w:top w:w="0" w:type="dxa"/>
-        <w:left w:w="108" w:type="dxa"/>
-        <w:bottom w:w="0" w:type="dxa"/>
-        <w:right w:w="108" w:type="dxa"/>
-      </w:tblCellMar>
     </w:tblPr>
     <w:tcPr>
       <w:shd w:val="clear" w:color="auto" w:fill="E5DFEC" w:themeFill="accent4" w:themeFillTint="33"/>
@@ -31860,16 +30733,9 @@
     <w:tblPr>
       <w:tblStyleRowBandSize w:val="1"/>
       <w:tblStyleColBandSize w:val="1"/>
-      <w:tblInd w:w="0" w:type="dxa"/>
       <w:tblBorders>
         <w:insideH w:val="single" w:sz="4" w:space="0" w:color="FFFFFF" w:themeColor="background1"/>
       </w:tblBorders>
-      <w:tblCellMar>
-        <w:top w:w="0" w:type="dxa"/>
-        <w:left w:w="108" w:type="dxa"/>
-        <w:bottom w:w="0" w:type="dxa"/>
-        <w:right w:w="108" w:type="dxa"/>
-      </w:tblCellMar>
     </w:tblPr>
     <w:tcPr>
       <w:shd w:val="clear" w:color="auto" w:fill="DAEEF3" w:themeFill="accent5" w:themeFillTint="33"/>
@@ -31940,16 +30806,9 @@
     <w:tblPr>
       <w:tblStyleRowBandSize w:val="1"/>
       <w:tblStyleColBandSize w:val="1"/>
-      <w:tblInd w:w="0" w:type="dxa"/>
       <w:tblBorders>
         <w:insideH w:val="single" w:sz="4" w:space="0" w:color="FFFFFF" w:themeColor="background1"/>
       </w:tblBorders>
-      <w:tblCellMar>
-        <w:top w:w="0" w:type="dxa"/>
-        <w:left w:w="108" w:type="dxa"/>
-        <w:bottom w:w="0" w:type="dxa"/>
-        <w:right w:w="108" w:type="dxa"/>
-      </w:tblCellMar>
     </w:tblPr>
     <w:tcPr>
       <w:shd w:val="clear" w:color="auto" w:fill="FDE9D9" w:themeFill="accent6" w:themeFillTint="33"/>
@@ -32040,6 +30899,18 @@
     <w:rPr>
       <w:color w:val="0000FF" w:themeColor="hyperlink"/>
       <w:u w:val="single"/>
+    </w:rPr>
+  </w:style>
+  <w:style w:type="character" w:styleId="Mencinsinresolver">
+    <w:name w:val="Unresolved Mention"/>
+    <w:basedOn w:val="Fuentedeprrafopredeter"/>
+    <w:uiPriority w:val="99"/>
+    <w:semiHidden/>
+    <w:unhideWhenUsed/>
+    <w:rsid w:val="00120BEC"/>
+    <w:rPr>
+      <w:color w:val="605E5C"/>
+      <w:shd w:val="clear" w:color="auto" w:fill="E1DFDD"/>
     </w:rPr>
   </w:style>
 </w:styles>

</xml_diff>